<commit_message>
Add three new internship entries and update Sagemcom title to Android Mobile Developer
</commit_message>
<xml_diff>
--- a/CV_ChedyKorbi_EN.docx
+++ b/CV_ChedyKorbi_EN.docx
@@ -35,13 +35,49 @@
       <w:pPr>
         <w:spacing w:after="16"/>
         <w:jc w:val="center"/>
-      </w:pPr>
-      <w:r>
-        <w:rPr>
-          <w:sz w:val="19"/>
-          <w:szCs w:val="19"/>
-        </w:rPr>
-        <w:t>chedykorbi2021@gmail.com   |   +216 58 239 045   |   linkedin.com/in/chedy-korbi   |   github.com/ChedyKorbi   |   La Marsa, Tunis</w:t>
+        <w:rPr>
+          <w:sz w:val="16"/>
+          <w:szCs w:val="16"/>
+        </w:rPr>
+      </w:pPr>
+      <w:r>
+        <w:rPr>
+          <w:sz w:val="16"/>
+          <w:szCs w:val="16"/>
+        </w:rPr>
+        <w:t>chedykorbi2021@gmail.com   |   +216 58 239 045   |   linkedin.com/in/</w:t>
+      </w:r>
+      <w:proofErr w:type="spellStart"/>
+      <w:r>
+        <w:rPr>
+          <w:sz w:val="16"/>
+          <w:szCs w:val="16"/>
+        </w:rPr>
+        <w:t>chedy-korbi</w:t>
+      </w:r>
+      <w:proofErr w:type="spellEnd"/>
+      <w:r>
+        <w:rPr>
+          <w:sz w:val="16"/>
+          <w:szCs w:val="16"/>
+        </w:rPr>
+        <w:t xml:space="preserve">   |   github.com/</w:t>
+      </w:r>
+      <w:proofErr w:type="spellStart"/>
+      <w:r>
+        <w:rPr>
+          <w:sz w:val="16"/>
+          <w:szCs w:val="16"/>
+        </w:rPr>
+        <w:t>ChedyKorbi</w:t>
+      </w:r>
+      <w:proofErr w:type="spellEnd"/>
+      <w:r>
+        <w:rPr>
+          <w:sz w:val="16"/>
+          <w:szCs w:val="16"/>
+        </w:rPr>
+        <w:t xml:space="preserve">   |   La Marsa, Tunis</w:t>
       </w:r>
     </w:p>
     <w:p>
@@ -71,7 +107,19 @@
         <w:spacing w:before="36" w:after="72"/>
       </w:pPr>
       <w:r>
-        <w:t>Engineering student in Big Data &amp; AI at Polytech International, holding a Licence in Embedded Systems &amp; Mobile Development. Strong software development background — mobile, web, and IoT — built through multiple internships, freelance projects, and team collaborations delivering real products under tight deadlines. Actively building my AI/ML and data profile through ongoing projects and certifications. Curious, autonomous, and always eager to learn and grow. Seeking a summer 2026 internship in AI/ML, data, or software development.</w:t>
+        <w:t>Engineering student in Big Data &amp; AI at Polytech International, holding a Licence in Embedded Systems &amp; Mobile Development. Strong software development background</w:t>
+      </w:r>
+      <w:r>
+        <w:t>,</w:t>
+      </w:r>
+      <w:r>
+        <w:t xml:space="preserve"> mobile, web, and IoT</w:t>
+      </w:r>
+      <w:r>
+        <w:t xml:space="preserve">, </w:t>
+      </w:r>
+      <w:r>
+        <w:t>built through multiple internships, freelance projects, and team collaborations delivering real products under tight deadlines. Actively building my AI/ML and data profile through ongoing projects and certifications. Curious, autonomous, and always eager to learn and grow. Seeking a summer 2026 internship in AI/ML, data, or software development.</w:t>
       </w:r>
     </w:p>
     <w:p>
@@ -178,10 +226,68 @@
     </w:p>
     <w:p>
       <w:pPr>
-        <w:spacing w:after="10"/>
-      </w:pPr>
-      <w:r>
-        <w:t>Cross-platform mobile app (iOS &amp; Android) for a health-tech startup: barcode scanning and an ML scoring engine generating explainable colour-coded risk indicators, validated by a database of certified nutritionists — making science-based nutritional assessment accessible to everyday consumers.</w:t>
+        <w:spacing w:before="6" w:after="60"/>
+        <w:rPr>
+          <w:lang w:val="fr-FR"/>
+        </w:rPr>
+      </w:pPr>
+      <w:r>
+        <w:rPr>
+          <w:lang w:val="fr-FR"/>
+        </w:rPr>
+        <w:t xml:space="preserve">Application mobile cross-platform (iOS &amp; Android) pour une experte nutritionniste : scan de codes-barres de produits alimentaires, cosmétiques et ménagers, avec génération d'une fiche produit validée incluant composition, score qualité et statut (Excellent / Bon / Moyen / Mauvais). Moteur de </w:t>
+      </w:r>
+      <w:proofErr w:type="spellStart"/>
+      <w:r>
+        <w:rPr>
+          <w:lang w:val="fr-FR"/>
+        </w:rPr>
+        <w:t>scoring</w:t>
+      </w:r>
+      <w:proofErr w:type="spellEnd"/>
+      <w:r>
+        <w:rPr>
+          <w:lang w:val="fr-FR"/>
+        </w:rPr>
+        <w:t xml:space="preserve"> ML basé sur </w:t>
+      </w:r>
+      <w:proofErr w:type="spellStart"/>
+      <w:r>
+        <w:rPr>
+          <w:lang w:val="fr-FR"/>
+        </w:rPr>
+        <w:t>Random</w:t>
+      </w:r>
+      <w:proofErr w:type="spellEnd"/>
+      <w:r>
+        <w:rPr>
+          <w:lang w:val="fr-FR"/>
+        </w:rPr>
+        <w:t xml:space="preserve"> Forest</w:t>
+      </w:r>
+      <w:r>
+        <w:rPr>
+          <w:lang w:val="fr-FR"/>
+        </w:rPr>
+        <w:t>,</w:t>
+      </w:r>
+      <w:r>
+        <w:rPr>
+          <w:lang w:val="fr-FR"/>
+        </w:rPr>
+        <w:t xml:space="preserve"> régression pour le score qualité, classification pour le statut</w:t>
+      </w:r>
+      <w:r>
+        <w:rPr>
+          <w:lang w:val="fr-FR"/>
+        </w:rPr>
+        <w:t xml:space="preserve">, </w:t>
+      </w:r>
+      <w:r>
+        <w:rPr>
+          <w:lang w:val="fr-FR"/>
+        </w:rPr>
+        <w:t>entraîné sur la base de produits validée par l'experte, avec indicateurs de risque codes couleur explicables.</w:t>
       </w:r>
     </w:p>
     <w:p>
@@ -198,6 +304,41 @@
         </w:rPr>
         <w:t>Flutter · Spring Boot · MySQL · REST APIs</w:t>
       </w:r>
+      <w:r>
+        <w:rPr>
+          <w:i/>
+          <w:iCs/>
+          <w:color w:val="555555"/>
+          <w:sz w:val="18"/>
+          <w:szCs w:val="18"/>
+        </w:rPr>
+        <w:t xml:space="preserve"> </w:t>
+      </w:r>
+      <w:r>
+        <w:rPr>
+          <w:i/>
+          <w:iCs/>
+          <w:color w:val="555555"/>
+          <w:sz w:val="18"/>
+          <w:szCs w:val="18"/>
+        </w:rPr>
+        <w:t xml:space="preserve">· </w:t>
+      </w:r>
+      <w:r>
+        <w:rPr>
+          <w:i/>
+          <w:iCs/>
+          <w:color w:val="555555"/>
+          <w:sz w:val="18"/>
+          <w:szCs w:val="18"/>
+        </w:rPr>
+        <w:t xml:space="preserve">Sickit Learn </w:t>
+      </w:r>
+    </w:p>
+    <w:p>
+      <w:pPr>
+        <w:spacing w:after="10"/>
+      </w:pPr>
     </w:p>
     <w:p>
       <w:pPr>
@@ -255,7 +396,23 @@
           <w:sz w:val="21"/>
           <w:szCs w:val="21"/>
         </w:rPr>
-        <w:t xml:space="preserve">  ·  Symatique Software</w:t>
+        <w:t xml:space="preserve">  ·  </w:t>
+      </w:r>
+      <w:proofErr w:type="spellStart"/>
+      <w:r>
+        <w:rPr>
+          <w:sz w:val="21"/>
+          <w:szCs w:val="21"/>
+        </w:rPr>
+        <w:t>Symatique</w:t>
+      </w:r>
+      <w:proofErr w:type="spellEnd"/>
+      <w:r>
+        <w:rPr>
+          <w:sz w:val="21"/>
+          <w:szCs w:val="21"/>
+        </w:rPr>
+        <w:t xml:space="preserve"> Software</w:t>
       </w:r>
       <w:r>
         <w:rPr>
@@ -264,15 +421,28 @@
           <w:szCs w:val="19"/>
         </w:rPr>
         <w:tab/>
-        <w:t>Jan 2025 – Jun 2025  |  Tunis</w:t>
+        <w:t xml:space="preserve">Jan 2025 – Jun 2025  </w:t>
       </w:r>
     </w:p>
     <w:p>
       <w:pPr>
         <w:spacing w:after="10"/>
       </w:pPr>
-      <w:r>
-        <w:t>PawTracker — IoT pet health monitoring ecosystem: ESP32 sensors continuously collecting activity and vital data, analysed by supervised regression and classification models calibrated to each animal’s breed and age to detect deviations from optimal health thresholds. Android app with live GPS tracking, health dashboards, and alerts; VetLink — Angular platform for veterinarians with patient records and appointment management.</w:t>
+      <w:proofErr w:type="spellStart"/>
+      <w:r>
+        <w:t>PawTracker</w:t>
+      </w:r>
+      <w:proofErr w:type="spellEnd"/>
+      <w:r>
+        <w:t xml:space="preserve"> — IoT pet health monitoring ecosystem: ESP32 sensors continuously collecting activity and vital data, analysed by supervised regression and classification models calibrated to each animal’s breed and age to detect deviations from optimal health thresholds. Android app with live GPS tracking, health dashboards, and alerts; </w:t>
+      </w:r>
+      <w:proofErr w:type="spellStart"/>
+      <w:r>
+        <w:t>VetLink</w:t>
+      </w:r>
+      <w:proofErr w:type="spellEnd"/>
+      <w:r>
+        <w:t xml:space="preserve"> — Angular platform for veterinarians with patient records and appointment management.</w:t>
       </w:r>
     </w:p>
     <w:p>
@@ -304,14 +474,55 @@
           <w:sz w:val="21"/>
           <w:szCs w:val="21"/>
         </w:rPr>
-        <w:t>Summer Internship — AI Mobile</w:t>
-      </w:r>
-      <w:r>
-        <w:rPr>
-          <w:sz w:val="21"/>
-          <w:szCs w:val="21"/>
-        </w:rPr>
-        <w:t xml:space="preserve">  ·  Sagemcom Software &amp; Technologies R&amp;D</w:t>
+        <w:t xml:space="preserve">Summer Internship — </w:t>
+      </w:r>
+      <w:r>
+        <w:rPr>
+          <w:b/>
+          <w:bCs/>
+          <w:sz w:val="21"/>
+          <w:szCs w:val="21"/>
+        </w:rPr>
+        <w:t>Android Developer</w:t>
+      </w:r>
+      <w:r>
+        <w:rPr>
+          <w:b/>
+          <w:bCs/>
+          <w:sz w:val="21"/>
+          <w:szCs w:val="21"/>
+        </w:rPr>
+        <w:t xml:space="preserve"> </w:t>
+      </w:r>
+      <w:r>
+        <w:rPr>
+          <w:sz w:val="21"/>
+          <w:szCs w:val="21"/>
+        </w:rPr>
+        <w:t xml:space="preserve">· </w:t>
+      </w:r>
+      <w:proofErr w:type="spellStart"/>
+      <w:r>
+        <w:rPr>
+          <w:sz w:val="21"/>
+          <w:szCs w:val="21"/>
+        </w:rPr>
+        <w:t>Sagemcom</w:t>
+      </w:r>
+      <w:proofErr w:type="spellEnd"/>
+      <w:r>
+        <w:rPr>
+          <w:sz w:val="21"/>
+          <w:szCs w:val="21"/>
+        </w:rPr>
+        <w:t xml:space="preserve"> Software &amp; Technologies</w:t>
+      </w:r>
+      <w:r>
+        <w:rPr>
+          <w:sz w:val="21"/>
+          <w:szCs w:val="21"/>
+        </w:rPr>
+        <w:t xml:space="preserve">    </w:t>
       </w:r>
       <w:r>
         <w:rPr>
@@ -319,8 +530,19 @@
           <w:sz w:val="19"/>
           <w:szCs w:val="19"/>
         </w:rPr>
-        <w:tab/>
-        <w:t>Jul 2024 – Aug 2024  |  Tunis</w:t>
+        <w:t xml:space="preserve"> </w:t>
+      </w:r>
+      <w:r>
+        <w:rPr>
+          <w:color w:val="555555"/>
+        </w:rPr>
+        <w:t xml:space="preserve">Jul 2024 – Aug </w:t>
+      </w:r>
+      <w:r>
+        <w:rPr>
+          <w:color w:val="555555"/>
+        </w:rPr>
+        <w:t>2024</w:t>
       </w:r>
     </w:p>
     <w:p>
@@ -328,7 +550,15 @@
         <w:spacing w:after="10"/>
       </w:pPr>
       <w:r>
-        <w:t>Android inventory management app for the water-sensor R&amp;D team: full product CRUD, advanced filtering, and local SQLite database. Integrated an EfficientNet CNN (TensorFlow Lite) for automatic recognition of existing products via camera — –80% data-entry errors, identification time cut from 30 s to under 5 s.</w:t>
+        <w:t xml:space="preserve">Android inventory management app for the water-sensor R&amp;D team: full product CRUD, advanced filtering, and local SQLite database. Integrated an </w:t>
+      </w:r>
+      <w:proofErr w:type="spellStart"/>
+      <w:r>
+        <w:t>EfficientNet</w:t>
+      </w:r>
+      <w:proofErr w:type="spellEnd"/>
+      <w:r>
+        <w:t xml:space="preserve"> CNN (TensorFlow Lite) for automatic recognition of existing products via camera — –80% data-entry errors, identification time cut from 30 s to under 5 s.</w:t>
       </w:r>
     </w:p>
     <w:p>
@@ -343,8 +573,42 @@
           <w:sz w:val="18"/>
           <w:szCs w:val="18"/>
         </w:rPr>
-        <w:t>Android Java · TensorFlow Lite · EfficientNet · Room DB · SQLite · ZXing</w:t>
-      </w:r>
+        <w:t xml:space="preserve">Android Java · TensorFlow Lite · </w:t>
+      </w:r>
+      <w:proofErr w:type="spellStart"/>
+      <w:r>
+        <w:rPr>
+          <w:i/>
+          <w:iCs/>
+          <w:color w:val="555555"/>
+          <w:sz w:val="18"/>
+          <w:szCs w:val="18"/>
+        </w:rPr>
+        <w:t>EfficientNet</w:t>
+      </w:r>
+      <w:proofErr w:type="spellEnd"/>
+      <w:r>
+        <w:rPr>
+          <w:i/>
+          <w:iCs/>
+          <w:color w:val="555555"/>
+          <w:sz w:val="18"/>
+          <w:szCs w:val="18"/>
+        </w:rPr>
+        <w:t xml:space="preserve"> · Room DB · SQLite · </w:t>
+      </w:r>
+      <w:proofErr w:type="spellStart"/>
+      <w:r>
+        <w:rPr>
+          <w:i/>
+          <w:iCs/>
+          <w:color w:val="555555"/>
+          <w:sz w:val="18"/>
+          <w:szCs w:val="18"/>
+        </w:rPr>
+        <w:t>ZXing</w:t>
+      </w:r>
+      <w:proofErr w:type="spellEnd"/>
     </w:p>
     <w:p>
       <w:pPr>
@@ -430,8 +694,17 @@
           <w:sz w:val="21"/>
           <w:szCs w:val="21"/>
         </w:rPr>
-        <w:t xml:space="preserve">  ·  ISET Charguia</w:t>
-      </w:r>
+        <w:t xml:space="preserve">  ·  ISET </w:t>
+      </w:r>
+      <w:proofErr w:type="spellStart"/>
+      <w:r>
+        <w:rPr>
+          <w:sz w:val="21"/>
+          <w:szCs w:val="21"/>
+        </w:rPr>
+        <w:t>Charguia</w:t>
+      </w:r>
+      <w:proofErr w:type="spellEnd"/>
       <w:r>
         <w:rPr>
           <w:color w:val="555555"/>
@@ -483,15 +756,25 @@
     <w:p>
       <w:pPr>
         <w:spacing w:before="180" w:after="60"/>
-      </w:pPr>
-      <w:r>
-        <w:rPr>
-          <w:b/>
-          <w:bCs/>
-          <w:sz w:val="21"/>
-          <w:szCs w:val="21"/>
-        </w:rPr>
-        <w:lastRenderedPageBreak/>
+        <w:rPr>
+          <w:b/>
+          <w:bCs/>
+          <w:sz w:val="21"/>
+          <w:szCs w:val="21"/>
+        </w:rPr>
+      </w:pPr>
+    </w:p>
+    <w:p>
+      <w:pPr>
+        <w:spacing w:before="180" w:after="60"/>
+      </w:pPr>
+      <w:r>
+        <w:rPr>
+          <w:b/>
+          <w:bCs/>
+          <w:sz w:val="21"/>
+          <w:szCs w:val="21"/>
+        </w:rPr>
         <w:t>PROJECTS</w:t>
       </w:r>
     </w:p>
@@ -531,7 +814,52 @@
         <w:spacing w:after="10"/>
       </w:pPr>
       <w:r>
-        <w:t>Multi-modal AI system generating structured consumer reports from product images and customer reviews. EfficientNetB3 pipeline (visual recognition) combined with a parallel NLP stack — BiLSTM, BERT, SmolLM2-1.7B — for sentiment, emotion, and feature extraction. Hybrid summarisation with BART / T5 / Qwen2.5 producing a clean structured report. Streamlit interface + Flask backend.</w:t>
+        <w:t xml:space="preserve">Multi-modal AI system generating structured consumer reports from </w:t>
+      </w:r>
+      <w:r>
+        <w:t xml:space="preserve">electronic </w:t>
+      </w:r>
+      <w:r>
+        <w:t>product images and customer reviews</w:t>
+      </w:r>
+      <w:r>
+        <w:t xml:space="preserve"> from Amazon </w:t>
+      </w:r>
+      <w:proofErr w:type="spellStart"/>
+      <w:r>
+        <w:t>kaggle</w:t>
+      </w:r>
+      <w:proofErr w:type="spellEnd"/>
+      <w:r>
+        <w:t xml:space="preserve"> datasets</w:t>
+      </w:r>
+      <w:r>
+        <w:t>. EfficientNetB3 pipeline (visual recognition) combined with a parallel NLP stack</w:t>
+      </w:r>
+      <w:r>
+        <w:t xml:space="preserve"> , </w:t>
+      </w:r>
+      <w:proofErr w:type="spellStart"/>
+      <w:r>
+        <w:t>BiLSTM</w:t>
+      </w:r>
+      <w:proofErr w:type="spellEnd"/>
+      <w:r>
+        <w:t>, BERT, SmolLM2-1.7B</w:t>
+      </w:r>
+      <w:r>
+        <w:t>,</w:t>
+      </w:r>
+      <w:r>
+        <w:t xml:space="preserve"> for sentiment, emotion, and feature extraction. Hybrid summarisation with BART / T5 / Qwen2.5 producing a clean structured report. </w:t>
+      </w:r>
+      <w:proofErr w:type="spellStart"/>
+      <w:r>
+        <w:t>Streamlit</w:t>
+      </w:r>
+      <w:proofErr w:type="spellEnd"/>
+      <w:r>
+        <w:t xml:space="preserve"> interface + Flask backend.</w:t>
       </w:r>
     </w:p>
     <w:p>
@@ -546,21 +874,76 @@
           <w:sz w:val="18"/>
           <w:szCs w:val="18"/>
         </w:rPr>
-        <w:t>Python · TensorFlow · PyTorch · EfficientNetB3 · BERT · Qwen2.5 · Streamlit · Flask</w:t>
+        <w:t xml:space="preserve">Python · TensorFlow · </w:t>
+      </w:r>
+      <w:proofErr w:type="spellStart"/>
+      <w:r>
+        <w:rPr>
+          <w:i/>
+          <w:iCs/>
+          <w:color w:val="555555"/>
+          <w:sz w:val="18"/>
+          <w:szCs w:val="18"/>
+        </w:rPr>
+        <w:t>PyTorch</w:t>
+      </w:r>
+      <w:proofErr w:type="spellEnd"/>
+      <w:r>
+        <w:rPr>
+          <w:i/>
+          <w:iCs/>
+          <w:color w:val="555555"/>
+          <w:sz w:val="18"/>
+          <w:szCs w:val="18"/>
+        </w:rPr>
+        <w:t xml:space="preserve"> · EfficientNetB3 · BERT · Qwen2.5 · </w:t>
+      </w:r>
+      <w:proofErr w:type="spellStart"/>
+      <w:r>
+        <w:rPr>
+          <w:i/>
+          <w:iCs/>
+          <w:color w:val="555555"/>
+          <w:sz w:val="18"/>
+          <w:szCs w:val="18"/>
+        </w:rPr>
+        <w:t>Streamlit</w:t>
+      </w:r>
+      <w:proofErr w:type="spellEnd"/>
+      <w:r>
+        <w:rPr>
+          <w:i/>
+          <w:iCs/>
+          <w:color w:val="555555"/>
+          <w:sz w:val="18"/>
+          <w:szCs w:val="18"/>
+        </w:rPr>
+        <w:t xml:space="preserve"> · Flask</w:t>
       </w:r>
     </w:p>
     <w:p>
       <w:pPr>
         <w:spacing w:before="140" w:after="18"/>
       </w:pPr>
-      <w:r>
-        <w:rPr>
-          <w:b/>
-          <w:bCs/>
-          <w:sz w:val="21"/>
-          <w:szCs w:val="21"/>
-        </w:rPr>
-        <w:t>GetHired AI</w:t>
+      <w:proofErr w:type="spellStart"/>
+      <w:r>
+        <w:rPr>
+          <w:b/>
+          <w:bCs/>
+          <w:sz w:val="21"/>
+          <w:szCs w:val="21"/>
+        </w:rPr>
+        <w:t>GetHired</w:t>
+      </w:r>
+      <w:proofErr w:type="spellEnd"/>
+      <w:r>
+        <w:rPr>
+          <w:b/>
+          <w:bCs/>
+          <w:sz w:val="21"/>
+          <w:szCs w:val="21"/>
+        </w:rPr>
+        <w:t xml:space="preserve"> AI</w:t>
       </w:r>
       <w:r>
         <w:rPr>
@@ -591,7 +974,49 @@
           <w:sz w:val="18"/>
           <w:szCs w:val="18"/>
         </w:rPr>
-        <w:t>Next.js 16 · Spring Boot · Groq LLM · TypeScript · Tailwind · JWT</w:t>
+        <w:t xml:space="preserve">Next.js 16 · Spring Boot · </w:t>
+      </w:r>
+      <w:proofErr w:type="spellStart"/>
+      <w:r>
+        <w:rPr>
+          <w:i/>
+          <w:iCs/>
+          <w:color w:val="555555"/>
+          <w:sz w:val="18"/>
+          <w:szCs w:val="18"/>
+        </w:rPr>
+        <w:t>Groq</w:t>
+      </w:r>
+      <w:proofErr w:type="spellEnd"/>
+      <w:r>
+        <w:rPr>
+          <w:i/>
+          <w:iCs/>
+          <w:color w:val="555555"/>
+          <w:sz w:val="18"/>
+          <w:szCs w:val="18"/>
+        </w:rPr>
+        <w:t xml:space="preserve"> LLM</w:t>
+      </w:r>
+      <w:r>
+        <w:rPr>
+          <w:i/>
+          <w:iCs/>
+          <w:color w:val="555555"/>
+          <w:sz w:val="18"/>
+          <w:szCs w:val="18"/>
+        </w:rPr>
+        <w:t xml:space="preserve"> QWEN 3.5</w:t>
+      </w:r>
+      <w:r>
+        <w:rPr>
+          <w:i/>
+          <w:iCs/>
+          <w:color w:val="555555"/>
+          <w:sz w:val="18"/>
+          <w:szCs w:val="18"/>
+        </w:rPr>
+        <w:t xml:space="preserve"> · TypeScript · Tailwind · JWT</w:t>
       </w:r>
     </w:p>
     <w:p>
@@ -655,11 +1080,40 @@
           <w:b/>
           <w:bCs/>
         </w:rPr>
-        <w:t xml:space="preserve">63H IoT PHPoC Certification </w:t>
-      </w:r>
-      <w:r>
-        <w:t>— PHPoC South Korea · ISET Charguia</w:t>
-      </w:r>
+        <w:t xml:space="preserve">63H IoT </w:t>
+      </w:r>
+      <w:proofErr w:type="spellStart"/>
+      <w:r>
+        <w:rPr>
+          <w:b/>
+          <w:bCs/>
+        </w:rPr>
+        <w:t>PHPoC</w:t>
+      </w:r>
+      <w:proofErr w:type="spellEnd"/>
+      <w:r>
+        <w:rPr>
+          <w:b/>
+          <w:bCs/>
+        </w:rPr>
+        <w:t xml:space="preserve"> Certification </w:t>
+      </w:r>
+      <w:r>
+        <w:t xml:space="preserve">— </w:t>
+      </w:r>
+      <w:proofErr w:type="spellStart"/>
+      <w:r>
+        <w:t>PHPoC</w:t>
+      </w:r>
+      <w:proofErr w:type="spellEnd"/>
+      <w:r>
+        <w:t xml:space="preserve"> South Korea · ISET </w:t>
+      </w:r>
+      <w:proofErr w:type="spellStart"/>
+      <w:r>
+        <w:t>Charguia</w:t>
+      </w:r>
+      <w:proofErr w:type="spellEnd"/>
     </w:p>
     <w:p>
       <w:pPr>
@@ -705,12 +1159,6 @@
         <w:gridCol w:w="8046"/>
       </w:tblGrid>
       <w:tr>
-        <w:tblPrEx>
-          <w:tblCellMar>
-            <w:top w:w="0" w:type="dxa"/>
-            <w:bottom w:w="0" w:type="dxa"/>
-          </w:tblCellMar>
-        </w:tblPrEx>
         <w:tc>
           <w:tcPr>
             <w:tcW w:w="1900" w:type="dxa"/>
@@ -761,18 +1209,37 @@
                 <w:sz w:val="19"/>
                 <w:szCs w:val="19"/>
               </w:rPr>
-              <w:t>Machine Learning · Deep Learning · NLP · Computer Vision · TensorFlow · PyTorch · Scikit-learn · Keras</w:t>
-            </w:r>
+              <w:t xml:space="preserve">Machine Learning · Deep Learning · NLP · Computer Vision · TensorFlow · </w:t>
+            </w:r>
+            <w:proofErr w:type="spellStart"/>
+            <w:r>
+              <w:rPr>
+                <w:sz w:val="19"/>
+                <w:szCs w:val="19"/>
+              </w:rPr>
+              <w:t>PyTorch</w:t>
+            </w:r>
+            <w:proofErr w:type="spellEnd"/>
+            <w:r>
+              <w:rPr>
+                <w:sz w:val="19"/>
+                <w:szCs w:val="19"/>
+              </w:rPr>
+              <w:t xml:space="preserve"> · Scikit-learn · </w:t>
+            </w:r>
+            <w:proofErr w:type="spellStart"/>
+            <w:r>
+              <w:rPr>
+                <w:sz w:val="19"/>
+                <w:szCs w:val="19"/>
+              </w:rPr>
+              <w:t>Keras</w:t>
+            </w:r>
+            <w:proofErr w:type="spellEnd"/>
           </w:p>
         </w:tc>
       </w:tr>
       <w:tr>
-        <w:tblPrEx>
-          <w:tblCellMar>
-            <w:top w:w="0" w:type="dxa"/>
-            <w:bottom w:w="0" w:type="dxa"/>
-          </w:tblCellMar>
-        </w:tblPrEx>
         <w:tc>
           <w:tcPr>
             <w:tcW w:w="1900" w:type="dxa"/>
@@ -823,18 +1290,44 @@
                 <w:sz w:val="19"/>
                 <w:szCs w:val="19"/>
               </w:rPr>
-              <w:t>Pandas · NumPy · Matplotlib · Seaborn · Plotly · Jupyter · SQL</w:t>
+              <w:t xml:space="preserve">Pandas · NumPy · Matplotlib · Seaborn · </w:t>
+            </w:r>
+            <w:proofErr w:type="spellStart"/>
+            <w:r>
+              <w:rPr>
+                <w:sz w:val="19"/>
+                <w:szCs w:val="19"/>
+              </w:rPr>
+              <w:t>Plotly</w:t>
+            </w:r>
+            <w:proofErr w:type="spellEnd"/>
+            <w:r>
+              <w:rPr>
+                <w:sz w:val="19"/>
+                <w:szCs w:val="19"/>
+              </w:rPr>
+              <w:t xml:space="preserve"> · </w:t>
+            </w:r>
+            <w:proofErr w:type="spellStart"/>
+            <w:r>
+              <w:rPr>
+                <w:sz w:val="19"/>
+                <w:szCs w:val="19"/>
+              </w:rPr>
+              <w:t>Jupyter</w:t>
+            </w:r>
+            <w:proofErr w:type="spellEnd"/>
+            <w:r>
+              <w:rPr>
+                <w:sz w:val="19"/>
+                <w:szCs w:val="19"/>
+              </w:rPr>
+              <w:t xml:space="preserve"> · SQL</w:t>
             </w:r>
           </w:p>
         </w:tc>
       </w:tr>
       <w:tr>
-        <w:tblPrEx>
-          <w:tblCellMar>
-            <w:top w:w="0" w:type="dxa"/>
-            <w:bottom w:w="0" w:type="dxa"/>
-          </w:tblCellMar>
-        </w:tblPrEx>
         <w:tc>
           <w:tcPr>
             <w:tcW w:w="1900" w:type="dxa"/>
@@ -891,18 +1384,30 @@
                 <w:szCs w:val="19"/>
                 <w:lang w:val="fr-FR"/>
               </w:rPr>
-              <w:t>Python · Java · JavaScript / TypeScript · Dart · C / C++ · SQL</w:t>
+              <w:t xml:space="preserve">Python · Java · JavaScript / </w:t>
+            </w:r>
+            <w:proofErr w:type="spellStart"/>
+            <w:r>
+              <w:rPr>
+                <w:sz w:val="19"/>
+                <w:szCs w:val="19"/>
+                <w:lang w:val="fr-FR"/>
+              </w:rPr>
+              <w:t>TypeScript</w:t>
+            </w:r>
+            <w:proofErr w:type="spellEnd"/>
+            <w:r>
+              <w:rPr>
+                <w:sz w:val="19"/>
+                <w:szCs w:val="19"/>
+                <w:lang w:val="fr-FR"/>
+              </w:rPr>
+              <w:t xml:space="preserve"> · Dart · C / C++ · SQL</w:t>
             </w:r>
           </w:p>
         </w:tc>
       </w:tr>
       <w:tr>
-        <w:tblPrEx>
-          <w:tblCellMar>
-            <w:top w:w="0" w:type="dxa"/>
-            <w:bottom w:w="0" w:type="dxa"/>
-          </w:tblCellMar>
-        </w:tblPrEx>
         <w:tc>
           <w:tcPr>
             <w:tcW w:w="1900" w:type="dxa"/>
@@ -953,18 +1458,28 @@
                 <w:sz w:val="19"/>
                 <w:szCs w:val="19"/>
               </w:rPr>
-              <w:t>Android Java · Flutter · React · Next.js · Angular · Streamlit · Django</w:t>
+              <w:t xml:space="preserve">Android Java · Flutter · React · Next.js · Angular · </w:t>
+            </w:r>
+            <w:proofErr w:type="spellStart"/>
+            <w:r>
+              <w:rPr>
+                <w:sz w:val="19"/>
+                <w:szCs w:val="19"/>
+              </w:rPr>
+              <w:t>Streamlit</w:t>
+            </w:r>
+            <w:proofErr w:type="spellEnd"/>
+            <w:r>
+              <w:rPr>
+                <w:sz w:val="19"/>
+                <w:szCs w:val="19"/>
+              </w:rPr>
+              <w:t xml:space="preserve"> · Django</w:t>
             </w:r>
           </w:p>
         </w:tc>
       </w:tr>
       <w:tr>
-        <w:tblPrEx>
-          <w:tblCellMar>
-            <w:top w:w="0" w:type="dxa"/>
-            <w:bottom w:w="0" w:type="dxa"/>
-          </w:tblCellMar>
-        </w:tblPrEx>
         <w:tc>
           <w:tcPr>
             <w:tcW w:w="1900" w:type="dxa"/>
@@ -1015,18 +1530,28 @@
                 <w:sz w:val="19"/>
                 <w:szCs w:val="19"/>
               </w:rPr>
-              <w:t>Spring Boot · Flask · FastAPI · Node.js · REST APIs · MySQL · MongoDB · SQLite</w:t>
+              <w:t xml:space="preserve">Spring Boot · Flask · </w:t>
+            </w:r>
+            <w:proofErr w:type="spellStart"/>
+            <w:r>
+              <w:rPr>
+                <w:sz w:val="19"/>
+                <w:szCs w:val="19"/>
+              </w:rPr>
+              <w:t>FastAPI</w:t>
+            </w:r>
+            <w:proofErr w:type="spellEnd"/>
+            <w:r>
+              <w:rPr>
+                <w:sz w:val="19"/>
+                <w:szCs w:val="19"/>
+              </w:rPr>
+              <w:t xml:space="preserve"> · Node.js · REST APIs · MySQL · MongoDB · SQLite</w:t>
             </w:r>
           </w:p>
         </w:tc>
       </w:tr>
       <w:tr>
-        <w:tblPrEx>
-          <w:tblCellMar>
-            <w:top w:w="0" w:type="dxa"/>
-            <w:bottom w:w="0" w:type="dxa"/>
-          </w:tblCellMar>
-        </w:tblPrEx>
         <w:tc>
           <w:tcPr>
             <w:tcW w:w="1900" w:type="dxa"/>
@@ -1083,12 +1608,6 @@
         </w:tc>
       </w:tr>
       <w:tr>
-        <w:tblPrEx>
-          <w:tblCellMar>
-            <w:top w:w="0" w:type="dxa"/>
-            <w:bottom w:w="0" w:type="dxa"/>
-          </w:tblCellMar>
-        </w:tblPrEx>
         <w:tc>
           <w:tcPr>
             <w:tcW w:w="1900" w:type="dxa"/>
@@ -1190,12 +1709,6 @@
         <w:gridCol w:w="3316"/>
       </w:tblGrid>
       <w:tr>
-        <w:tblPrEx>
-          <w:tblCellMar>
-            <w:top w:w="0" w:type="dxa"/>
-            <w:bottom w:w="0" w:type="dxa"/>
-          </w:tblCellMar>
-        </w:tblPrEx>
         <w:tc>
           <w:tcPr>
             <w:tcW w:w="3315" w:type="dxa"/>
@@ -1924,7 +2437,6 @@
   <w:style w:type="character" w:default="1" w:styleId="DefaultParagraphFont">
     <w:name w:val="Default Paragraph Font"/>
     <w:uiPriority w:val="1"/>
-    <w:semiHidden/>
     <w:unhideWhenUsed/>
   </w:style>
   <w:style w:type="table" w:default="1" w:styleId="TableNormal">

</xml_diff>

<commit_message>
Add Aether Analyst project: Local-First Agentic AI for Data Intelligence
- Create comprehensive case study for Aether Analyst (project-aether-analyst-case-study.html)
- Add project to portfolio landing page as featured #01 project
- Update all project numbering (02-08) to accommodate new project
- Include full technical details: LangGraph orchestration, sandbox execution, RAG pipeline
- Showcase key differentiators: agentic self-correction, secure execution, offline capability
- Add to AI/ML full-stack filters with proper metadata
</commit_message>
<xml_diff>
--- a/CV_ChedyKorbi_EN.docx
+++ b/CV_ChedyKorbi_EN.docx
@@ -1,6 +1,6 @@
 
 <file path=word/document.xml><?xml version="1.0" encoding="utf-8"?>
-<w:document xmlns:wpc="http://schemas.microsoft.com/office/word/2010/wordprocessingCanvas" xmlns:cx="http://schemas.microsoft.com/office/drawing/2014/chartex" xmlns:cx1="http://schemas.microsoft.com/office/drawing/2015/9/8/chartex" xmlns:cx2="http://schemas.microsoft.com/office/drawing/2015/10/21/chartex" xmlns:cx3="http://schemas.microsoft.com/office/drawing/2016/5/9/chartex" xmlns:cx4="http://schemas.microsoft.com/office/drawing/2016/5/10/chartex" xmlns:cx5="http://schemas.microsoft.com/office/drawing/2016/5/11/chartex" xmlns:cx6="http://schemas.microsoft.com/office/drawing/2016/5/12/chartex" xmlns:cx7="http://schemas.microsoft.com/office/drawing/2016/5/13/chartex" xmlns:cx8="http://schemas.microsoft.com/office/drawing/2016/5/14/chartex" xmlns:mc="http://schemas.openxmlformats.org/markup-compatibility/2006" xmlns:aink="http://schemas.microsoft.com/office/drawing/2016/ink" xmlns:am3d="http://schemas.microsoft.com/office/drawing/2017/model3d" xmlns:o="urn:schemas-microsoft-com:office:office" xmlns:oel="http://schemas.microsoft.com/office/2019/extlst" xmlns:r="http://schemas.openxmlformats.org/officeDocument/2006/relationships" xmlns:m="http://schemas.openxmlformats.org/officeDocument/2006/math" xmlns:v="urn:schemas-microsoft-com:vml" xmlns:wp14="http://schemas.microsoft.com/office/word/2010/wordprocessingDrawing" xmlns:wp="http://schemas.openxmlformats.org/drawingml/2006/wordprocessingDrawing" xmlns:w10="urn:schemas-microsoft-com:office:word" xmlns:w="http://schemas.openxmlformats.org/wordprocessingml/2006/main" xmlns:w14="http://schemas.microsoft.com/office/word/2010/wordml" xmlns:w15="http://schemas.microsoft.com/office/word/2012/wordml" xmlns:w16cex="http://schemas.microsoft.com/office/word/2018/wordml/cex" xmlns:w16cid="http://schemas.microsoft.com/office/word/2016/wordml/cid" xmlns:w16="http://schemas.microsoft.com/office/word/2018/wordml" xmlns:w16sdtdh="http://schemas.microsoft.com/office/word/2020/wordml/sdtdatahash" xmlns:w16se="http://schemas.microsoft.com/office/word/2015/wordml/symex" xmlns:wpg="http://schemas.microsoft.com/office/word/2010/wordprocessingGroup" xmlns:wpi="http://schemas.microsoft.com/office/word/2010/wordprocessingInk" xmlns:wne="http://schemas.microsoft.com/office/word/2006/wordml" xmlns:wps="http://schemas.microsoft.com/office/word/2010/wordprocessingShape" mc:Ignorable="w14 w15 w16se w16cid w16 w16cex w16sdtdh wp14">
+<w:document xmlns:wpc="http://schemas.microsoft.com/office/word/2010/wordprocessingCanvas" xmlns:cx="http://schemas.microsoft.com/office/drawing/2014/chartex" xmlns:cx1="http://schemas.microsoft.com/office/drawing/2015/9/8/chartex" xmlns:cx2="http://schemas.microsoft.com/office/drawing/2015/10/21/chartex" xmlns:cx3="http://schemas.microsoft.com/office/drawing/2016/5/9/chartex" xmlns:cx4="http://schemas.microsoft.com/office/drawing/2016/5/10/chartex" xmlns:cx5="http://schemas.microsoft.com/office/drawing/2016/5/11/chartex" xmlns:cx6="http://schemas.microsoft.com/office/drawing/2016/5/12/chartex" xmlns:cx7="http://schemas.microsoft.com/office/drawing/2016/5/13/chartex" xmlns:cx8="http://schemas.microsoft.com/office/drawing/2016/5/14/chartex" xmlns:mc="http://schemas.openxmlformats.org/markup-compatibility/2006" xmlns:aink="http://schemas.microsoft.com/office/drawing/2016/ink" xmlns:am3d="http://schemas.microsoft.com/office/drawing/2017/model3d" xmlns:o="urn:schemas-microsoft-com:office:office" xmlns:oel="http://schemas.microsoft.com/office/2019/extlst" xmlns:r="http://schemas.openxmlformats.org/officeDocument/2006/relationships" xmlns:m="http://schemas.openxmlformats.org/officeDocument/2006/math" xmlns:v="urn:schemas-microsoft-com:vml" xmlns:wp14="http://schemas.microsoft.com/office/word/2010/wordprocessingDrawing" xmlns:wp="http://schemas.openxmlformats.org/drawingml/2006/wordprocessingDrawing" xmlns:w10="urn:schemas-microsoft-com:office:word" xmlns:w="http://schemas.openxmlformats.org/wordprocessingml/2006/main" xmlns:w14="http://schemas.microsoft.com/office/word/2010/wordml" xmlns:w15="http://schemas.microsoft.com/office/word/2012/wordml" xmlns:w16cex="http://schemas.microsoft.com/office/word/2018/wordml/cex" xmlns:w16cid="http://schemas.microsoft.com/office/word/2016/wordml/cid" xmlns:w16="http://schemas.microsoft.com/office/word/2018/wordml" xmlns:w16du="http://schemas.microsoft.com/office/word/2023/wordml/word16du" xmlns:w16sdtdh="http://schemas.microsoft.com/office/word/2020/wordml/sdtdatahash" xmlns:w16sdtfl="http://schemas.microsoft.com/office/word/2024/wordml/sdtformatlock" xmlns:w16se="http://schemas.microsoft.com/office/word/2015/wordml/symex" xmlns:wpg="http://schemas.microsoft.com/office/word/2010/wordprocessingGroup" xmlns:wpi="http://schemas.microsoft.com/office/word/2010/wordprocessingInk" xmlns:wne="http://schemas.microsoft.com/office/word/2006/wordml" xmlns:wps="http://schemas.microsoft.com/office/word/2010/wordprocessingShape" mc:Ignorable="w14 w15 w16se w16cid w16 w16cex w16sdtdh w16sdtfl w16du wp14">
   <w:body>
     <w:p>
       <w:pPr>
@@ -45,39 +45,7 @@
           <w:sz w:val="16"/>
           <w:szCs w:val="16"/>
         </w:rPr>
-        <w:t>chedykorbi2021@gmail.com   |   +216 58 239 045   |   linkedin.com/in/</w:t>
-      </w:r>
-      <w:proofErr w:type="spellStart"/>
-      <w:r>
-        <w:rPr>
-          <w:sz w:val="16"/>
-          <w:szCs w:val="16"/>
-        </w:rPr>
-        <w:t>chedy-korbi</w:t>
-      </w:r>
-      <w:proofErr w:type="spellEnd"/>
-      <w:r>
-        <w:rPr>
-          <w:sz w:val="16"/>
-          <w:szCs w:val="16"/>
-        </w:rPr>
-        <w:t xml:space="preserve">   |   github.com/</w:t>
-      </w:r>
-      <w:proofErr w:type="spellStart"/>
-      <w:r>
-        <w:rPr>
-          <w:sz w:val="16"/>
-          <w:szCs w:val="16"/>
-        </w:rPr>
-        <w:t>ChedyKorbi</w:t>
-      </w:r>
-      <w:proofErr w:type="spellEnd"/>
-      <w:r>
-        <w:rPr>
-          <w:sz w:val="16"/>
-          <w:szCs w:val="16"/>
-        </w:rPr>
-        <w:t xml:space="preserve">   |   La Marsa, Tunis</w:t>
+        <w:t>chedykorbi2021@gmail.com   |   +216 58 239 045   |   linkedin.com/in/chedy-korbi   |   github.com/ChedyKorbi   |   La Marsa, Tunis</w:t>
       </w:r>
     </w:p>
     <w:p>
@@ -215,11 +183,15 @@
     <w:p>
       <w:pPr>
         <w:spacing w:before="100" w:after="14"/>
-      </w:pPr>
-      <w:r>
-        <w:rPr>
-          <w:b/>
-          <w:bCs/>
+        <w:rPr>
+          <w:lang w:val="fr-FR"/>
+        </w:rPr>
+      </w:pPr>
+      <w:r>
+        <w:rPr>
+          <w:b/>
+          <w:bCs/>
+          <w:lang w:val="fr-FR"/>
         </w:rPr>
         <w:t>SCIO — Nutritional Evaluation App</w:t>
       </w:r>
@@ -235,35 +207,7 @@
         <w:rPr>
           <w:lang w:val="fr-FR"/>
         </w:rPr>
-        <w:t xml:space="preserve">Application mobile cross-platform (iOS &amp; Android) pour une experte nutritionniste : scan de codes-barres de produits alimentaires, cosmétiques et ménagers, avec génération d'une fiche produit validée incluant composition, score qualité et statut (Excellent / Bon / Moyen / Mauvais). Moteur de </w:t>
-      </w:r>
-      <w:proofErr w:type="spellStart"/>
-      <w:r>
-        <w:rPr>
-          <w:lang w:val="fr-FR"/>
-        </w:rPr>
-        <w:t>scoring</w:t>
-      </w:r>
-      <w:proofErr w:type="spellEnd"/>
-      <w:r>
-        <w:rPr>
-          <w:lang w:val="fr-FR"/>
-        </w:rPr>
-        <w:t xml:space="preserve"> ML basé sur </w:t>
-      </w:r>
-      <w:proofErr w:type="spellStart"/>
-      <w:r>
-        <w:rPr>
-          <w:lang w:val="fr-FR"/>
-        </w:rPr>
-        <w:t>Random</w:t>
-      </w:r>
-      <w:proofErr w:type="spellEnd"/>
-      <w:r>
-        <w:rPr>
-          <w:lang w:val="fr-FR"/>
-        </w:rPr>
-        <w:t xml:space="preserve"> Forest</w:t>
+        <w:t>Application mobile cross-platform (iOS &amp; Android) pour une experte nutritionniste : scan de codes-barres de produits alimentaires, cosmétiques et ménagers, avec génération d'une fiche produit validée incluant composition, score qualité et statut (Excellent / Bon / Moyen / Mauvais). Moteur de scoring ML basé sur Random Forest</w:t>
       </w:r>
       <w:r>
         <w:rPr>
@@ -302,8 +246,38 @@
           <w:sz w:val="18"/>
           <w:szCs w:val="18"/>
         </w:rPr>
-        <w:t>Flutter · Spring Boot · MySQL · REST APIs</w:t>
-      </w:r>
+        <w:t xml:space="preserve">Flutter · Spring Boot · MySQL · REST APIs · Sickit Learn </w:t>
+      </w:r>
+    </w:p>
+    <w:p>
+      <w:pPr>
+        <w:spacing w:after="10"/>
+      </w:pPr>
+    </w:p>
+    <w:p>
+      <w:pPr>
+        <w:spacing w:before="100" w:after="14"/>
+      </w:pPr>
+      <w:r>
+        <w:rPr>
+          <w:b/>
+          <w:bCs/>
+        </w:rPr>
+        <w:t>CIM SALABYM — E-commerce &amp; Management Back-Office</w:t>
+      </w:r>
+    </w:p>
+    <w:p>
+      <w:pPr>
+        <w:spacing w:after="10"/>
+      </w:pPr>
+      <w:r>
+        <w:t>End-to-end digital solution for a ceramic decoration brand: fully customisable Next.js storefront (products, categories, collections, delivery, editorial content, images) with Stripe payments and OAuth. Admin back-office covering inventory, orders, CMS, CRM, and full site configuration — a bespoke, self-managed tool delivered end-to-end.</w:t>
+      </w:r>
+    </w:p>
+    <w:p>
+      <w:pPr>
+        <w:spacing w:before="6" w:after="60"/>
+      </w:pPr>
       <w:r>
         <w:rPr>
           <w:i/>
@@ -312,8 +286,54 @@
           <w:sz w:val="18"/>
           <w:szCs w:val="18"/>
         </w:rPr>
-        <w:t xml:space="preserve"> </w:t>
-      </w:r>
+        <w:t>Next.js · Spring Boot · Stripe · OAuth · MySQL</w:t>
+      </w:r>
+    </w:p>
+    <w:p>
+      <w:pPr>
+        <w:tabs>
+          <w:tab w:val="right" w:pos="9946"/>
+        </w:tabs>
+        <w:spacing w:before="140" w:after="20"/>
+      </w:pPr>
+      <w:r>
+        <w:rPr>
+          <w:b/>
+          <w:bCs/>
+          <w:sz w:val="21"/>
+          <w:szCs w:val="21"/>
+        </w:rPr>
+        <w:t>Final-Year Internship — IoT &amp; Full-Stack</w:t>
+      </w:r>
+      <w:r>
+        <w:rPr>
+          <w:sz w:val="21"/>
+          <w:szCs w:val="21"/>
+        </w:rPr>
+        <w:t xml:space="preserve">  ·  Symatique Software</w:t>
+      </w:r>
+      <w:r>
+        <w:rPr>
+          <w:color w:val="555555"/>
+          <w:sz w:val="19"/>
+          <w:szCs w:val="19"/>
+        </w:rPr>
+        <w:tab/>
+        <w:t xml:space="preserve">Jan 2025 – Jun 2025  </w:t>
+      </w:r>
+    </w:p>
+    <w:p>
+      <w:pPr>
+        <w:spacing w:after="10"/>
+      </w:pPr>
+      <w:r>
+        <w:t>PawTracker — IoT pet health monitoring ecosystem: ESP32 sensors continuously collecting activity and vital data, analysed by supervised regression and classification models calibrated to each animal’s breed and age to detect deviations from optimal health thresholds. Android app with live GPS tracking, health dashboards, and alerts; VetLink — Angular platform for veterinarians with patient records and appointment management.</w:t>
+      </w:r>
+    </w:p>
+    <w:p>
+      <w:pPr>
+        <w:spacing w:before="6" w:after="60"/>
+      </w:pPr>
       <w:r>
         <w:rPr>
           <w:i/>
@@ -322,8 +342,90 @@
           <w:sz w:val="18"/>
           <w:szCs w:val="18"/>
         </w:rPr>
-        <w:t xml:space="preserve">· </w:t>
-      </w:r>
+        <w:t>ESP32 · C/C++ · MQTT · Android Java · Spring Boot · Angular · MySQL · Firebase · Scikit-learn</w:t>
+      </w:r>
+    </w:p>
+    <w:p>
+      <w:pPr>
+        <w:tabs>
+          <w:tab w:val="right" w:pos="9946"/>
+        </w:tabs>
+        <w:spacing w:before="140" w:after="20"/>
+      </w:pPr>
+      <w:r>
+        <w:rPr>
+          <w:b/>
+          <w:bCs/>
+          <w:sz w:val="21"/>
+          <w:szCs w:val="21"/>
+        </w:rPr>
+        <w:t xml:space="preserve">Summer Internship — </w:t>
+      </w:r>
+      <w:r>
+        <w:rPr>
+          <w:b/>
+          <w:bCs/>
+          <w:sz w:val="21"/>
+          <w:szCs w:val="21"/>
+        </w:rPr>
+        <w:t>Android Developer</w:t>
+      </w:r>
+      <w:r>
+        <w:rPr>
+          <w:b/>
+          <w:bCs/>
+          <w:sz w:val="21"/>
+          <w:szCs w:val="21"/>
+        </w:rPr>
+        <w:t xml:space="preserve"> </w:t>
+      </w:r>
+      <w:r>
+        <w:rPr>
+          <w:sz w:val="21"/>
+          <w:szCs w:val="21"/>
+        </w:rPr>
+        <w:t>· Sagemcom Software &amp; Technologies</w:t>
+      </w:r>
+      <w:r>
+        <w:rPr>
+          <w:sz w:val="21"/>
+          <w:szCs w:val="21"/>
+        </w:rPr>
+        <w:t xml:space="preserve">    </w:t>
+      </w:r>
+      <w:r>
+        <w:rPr>
+          <w:color w:val="555555"/>
+          <w:sz w:val="19"/>
+          <w:szCs w:val="19"/>
+        </w:rPr>
+        <w:t xml:space="preserve"> </w:t>
+      </w:r>
+      <w:r>
+        <w:rPr>
+          <w:color w:val="555555"/>
+        </w:rPr>
+        <w:t xml:space="preserve">Jul 2024 – Aug </w:t>
+      </w:r>
+      <w:r>
+        <w:rPr>
+          <w:color w:val="555555"/>
+        </w:rPr>
+        <w:t>2024</w:t>
+      </w:r>
+    </w:p>
+    <w:p>
+      <w:pPr>
+        <w:spacing w:after="10"/>
+      </w:pPr>
+      <w:r>
+        <w:t>Android inventory management app for the water-sensor R&amp;D team: full product CRUD, advanced filtering, and local SQLite database. Integrated an EfficientNet CNN (TensorFlow Lite) for automatic recognition of existing products via camera — –80% data-entry errors, identification time cut from 30 s to under 5 s.</w:t>
+      </w:r>
+    </w:p>
+    <w:p>
+      <w:pPr>
+        <w:spacing w:before="6" w:after="60"/>
+      </w:pPr>
       <w:r>
         <w:rPr>
           <w:i/>
@@ -332,24 +434,176 @@
           <w:sz w:val="18"/>
           <w:szCs w:val="18"/>
         </w:rPr>
-        <w:t xml:space="preserve">Sickit Learn </w:t>
+        <w:t>Android Java · TensorFlow Lite · EfficientNet · Room DB · SQLite · ZXing</w:t>
+      </w:r>
+    </w:p>
+    <w:p>
+      <w:pPr>
+        <w:pBdr>
+          <w:bottom w:val="single" w:sz="4" w:space="1" w:color="000000"/>
+        </w:pBdr>
+        <w:spacing w:before="60" w:after="60"/>
+      </w:pPr>
+    </w:p>
+    <w:p>
+      <w:pPr>
+        <w:spacing w:before="180" w:after="60"/>
+      </w:pPr>
+      <w:r>
+        <w:rPr>
+          <w:b/>
+          <w:bCs/>
+          <w:sz w:val="21"/>
+          <w:szCs w:val="21"/>
+        </w:rPr>
+        <w:t>EDUCATION</w:t>
+      </w:r>
+    </w:p>
+    <w:p>
+      <w:pPr>
+        <w:tabs>
+          <w:tab w:val="right" w:pos="9946"/>
+        </w:tabs>
+        <w:spacing w:before="140" w:after="20"/>
+      </w:pPr>
+      <w:r>
+        <w:rPr>
+          <w:b/>
+          <w:bCs/>
+          <w:sz w:val="21"/>
+          <w:szCs w:val="21"/>
+        </w:rPr>
+        <w:t>Engineering Degree — Big Data &amp; AI</w:t>
+      </w:r>
+      <w:r>
+        <w:rPr>
+          <w:sz w:val="21"/>
+          <w:szCs w:val="21"/>
+        </w:rPr>
+        <w:t xml:space="preserve">  ·  Polytech International</w:t>
+      </w:r>
+      <w:r>
+        <w:rPr>
+          <w:color w:val="555555"/>
+          <w:sz w:val="19"/>
+          <w:szCs w:val="19"/>
+        </w:rPr>
+        <w:tab/>
+        <w:t>Sep 2025 – Present  |  Tunis</w:t>
       </w:r>
     </w:p>
     <w:p>
       <w:pPr>
         <w:spacing w:after="10"/>
       </w:pPr>
-    </w:p>
-    <w:p>
-      <w:pPr>
-        <w:spacing w:before="100" w:after="14"/>
-      </w:pPr>
-      <w:r>
-        <w:rPr>
-          <w:b/>
-          <w:bCs/>
-        </w:rPr>
-        <w:t>CIM SALABYM — E-commerce &amp; Management Back-Office</w:t>
+      <w:r>
+        <w:t>First-year common core in progress. Specialisation in Big Data &amp; AI.</w:t>
+      </w:r>
+    </w:p>
+    <w:p>
+      <w:pPr>
+        <w:tabs>
+          <w:tab w:val="right" w:pos="9946"/>
+        </w:tabs>
+        <w:spacing w:before="140" w:after="20"/>
+      </w:pPr>
+      <w:r>
+        <w:rPr>
+          <w:b/>
+          <w:bCs/>
+          <w:sz w:val="21"/>
+          <w:szCs w:val="21"/>
+        </w:rPr>
+        <w:t>Licence — Embedded Systems &amp; Mobile Development</w:t>
+      </w:r>
+      <w:r>
+        <w:rPr>
+          <w:sz w:val="21"/>
+          <w:szCs w:val="21"/>
+        </w:rPr>
+        <w:t xml:space="preserve">  ·  ISET Charguia</w:t>
+      </w:r>
+      <w:r>
+        <w:rPr>
+          <w:color w:val="555555"/>
+          <w:sz w:val="19"/>
+          <w:szCs w:val="19"/>
+        </w:rPr>
+        <w:tab/>
+        <w:t>2022 – 2025  |  Tunis</w:t>
+      </w:r>
+    </w:p>
+    <w:p>
+      <w:pPr>
+        <w:spacing w:after="60"/>
+      </w:pPr>
+      <w:r>
+        <w:t>GPA 16.78/20 . Core modules: IoT systems, embedded C/C++, Android development, computer networks.</w:t>
+      </w:r>
+    </w:p>
+    <w:p>
+      <w:pPr>
+        <w:pBdr>
+          <w:bottom w:val="single" w:sz="4" w:space="1" w:color="000000"/>
+        </w:pBdr>
+        <w:spacing w:before="60" w:after="60"/>
+      </w:pPr>
+    </w:p>
+    <w:p>
+      <w:pPr>
+        <w:spacing w:before="180" w:after="60"/>
+        <w:rPr>
+          <w:b/>
+          <w:bCs/>
+          <w:sz w:val="21"/>
+          <w:szCs w:val="21"/>
+        </w:rPr>
+      </w:pPr>
+    </w:p>
+    <w:p>
+      <w:pPr>
+        <w:spacing w:before="180" w:after="60"/>
+      </w:pPr>
+      <w:r>
+        <w:rPr>
+          <w:b/>
+          <w:bCs/>
+          <w:sz w:val="21"/>
+          <w:szCs w:val="21"/>
+        </w:rPr>
+        <w:lastRenderedPageBreak/>
+        <w:t>PROJECTS</w:t>
+      </w:r>
+    </w:p>
+    <w:p>
+      <w:pPr>
+        <w:spacing w:before="140" w:after="18"/>
+      </w:pPr>
+      <w:r>
+        <w:rPr>
+          <w:b/>
+          <w:bCs/>
+          <w:sz w:val="21"/>
+          <w:szCs w:val="21"/>
+        </w:rPr>
+        <w:t>Intelligent Report Generator</w:t>
+      </w:r>
+      <w:r>
+        <w:rPr>
+          <w:color w:val="555555"/>
+          <w:sz w:val="19"/>
+          <w:szCs w:val="19"/>
+        </w:rPr>
+        <w:t xml:space="preserve">  ·  Samsung Innovation Campus AI Capstone</w:t>
+      </w:r>
+      <w:r>
+        <w:rPr>
+          <w:b/>
+          <w:bCs/>
+          <w:sz w:val="19"/>
+          <w:szCs w:val="19"/>
+        </w:rPr>
+        <w:t xml:space="preserve">  —  Score 94% — Top 6%</w:t>
       </w:r>
     </w:p>
     <w:p>
@@ -357,7 +611,31 @@
         <w:spacing w:after="10"/>
       </w:pPr>
       <w:r>
-        <w:t>End-to-end digital solution for a ceramic decoration brand: fully customisable Next.js storefront (products, categories, collections, delivery, editorial content, images) with Stripe payments and OAuth. Admin back-office covering inventory, orders, CMS, CRM, and full site configuration — a bespoke, self-managed tool delivered end-to-end.</w:t>
+        <w:t xml:space="preserve">Multi-modal AI system generating structured consumer reports from </w:t>
+      </w:r>
+      <w:r>
+        <w:t xml:space="preserve">electronic </w:t>
+      </w:r>
+      <w:r>
+        <w:t>product images and customer reviews</w:t>
+      </w:r>
+      <w:r>
+        <w:t xml:space="preserve"> from Amazon kaggle datasets</w:t>
+      </w:r>
+      <w:r>
+        <w:t>. EfficientNetB3 pipeline (visual recognition) combined with a parallel NLP stack</w:t>
+      </w:r>
+      <w:r>
+        <w:t xml:space="preserve"> , </w:t>
+      </w:r>
+      <w:r>
+        <w:t>BiLSTM, BERT, SmolLM2-1.7B</w:t>
+      </w:r>
+      <w:r>
+        <w:t>,</w:t>
+      </w:r>
+      <w:r>
+        <w:t xml:space="preserve"> for sentiment, emotion, and feature extraction. Hybrid summarisation with BART / T5 / Qwen2.5 producing a clean structured report. Streamlit interface + Flask backend.</w:t>
       </w:r>
     </w:p>
     <w:p>
@@ -372,15 +650,12 @@
           <w:sz w:val="18"/>
           <w:szCs w:val="18"/>
         </w:rPr>
-        <w:t>Next.js · Spring Boot · Stripe · OAuth · MySQL</w:t>
-      </w:r>
-    </w:p>
-    <w:p>
-      <w:pPr>
-        <w:tabs>
-          <w:tab w:val="right" w:pos="9946"/>
-        </w:tabs>
-        <w:spacing w:before="140" w:after="20"/>
+        <w:t>Python · TensorFlow · PyTorch · EfficientNetB3 · BERT · Qwen2.5 · Streamlit · Flask</w:t>
+      </w:r>
+    </w:p>
+    <w:p>
+      <w:pPr>
+        <w:spacing w:before="140" w:after="18"/>
       </w:pPr>
       <w:r>
         <w:rPr>
@@ -389,30 +664,7 @@
           <w:sz w:val="21"/>
           <w:szCs w:val="21"/>
         </w:rPr>
-        <w:t>Final-Year Internship — IoT &amp; Full-Stack</w:t>
-      </w:r>
-      <w:r>
-        <w:rPr>
-          <w:sz w:val="21"/>
-          <w:szCs w:val="21"/>
-        </w:rPr>
-        <w:t xml:space="preserve">  ·  </w:t>
-      </w:r>
-      <w:proofErr w:type="spellStart"/>
-      <w:r>
-        <w:rPr>
-          <w:sz w:val="21"/>
-          <w:szCs w:val="21"/>
-        </w:rPr>
-        <w:t>Symatique</w:t>
-      </w:r>
-      <w:proofErr w:type="spellEnd"/>
-      <w:r>
-        <w:rPr>
-          <w:sz w:val="21"/>
-          <w:szCs w:val="21"/>
-        </w:rPr>
-        <w:t xml:space="preserve"> Software</w:t>
+        <w:t>GetHired AI</w:t>
       </w:r>
       <w:r>
         <w:rPr>
@@ -420,36 +672,20 @@
           <w:sz w:val="19"/>
           <w:szCs w:val="19"/>
         </w:rPr>
-        <w:tab/>
-        <w:t xml:space="preserve">Jan 2025 – Jun 2025  </w:t>
+        <w:t xml:space="preserve">  ·  Full-Stack AI Recruitment Platform</w:t>
       </w:r>
     </w:p>
     <w:p>
       <w:pPr>
         <w:spacing w:after="10"/>
       </w:pPr>
-      <w:proofErr w:type="spellStart"/>
-      <w:r>
-        <w:t>PawTracker</w:t>
-      </w:r>
-      <w:proofErr w:type="spellEnd"/>
-      <w:r>
-        <w:t xml:space="preserve"> — IoT pet health monitoring ecosystem: ESP32 sensors continuously collecting activity and vital data, analysed by supervised regression and classification models calibrated to each animal’s breed and age to detect deviations from optimal health thresholds. Android app with live GPS tracking, health dashboards, and alerts; </w:t>
-      </w:r>
-      <w:proofErr w:type="spellStart"/>
-      <w:r>
-        <w:t>VetLink</w:t>
-      </w:r>
-      <w:proofErr w:type="spellEnd"/>
-      <w:r>
-        <w:t xml:space="preserve"> — Angular platform for veterinarians with patient records and appointment management.</w:t>
+      <w:r>
+        <w:t>End-to-end recruitment platform — two portals, one goal: connecting the right candidates to the right recruiters through AI. Candidate side: CV analysis and enhancement, explainable fit scoring (0–100), personalised certification and skill recommendations to reach the target role, and interview preparation. Recruiter side: automatic candidate ranking based on profile and job requirements, interview plan generation, and targeted outreach. Multilingual (EN/FR), 18 AI modules.</w:t>
       </w:r>
     </w:p>
     <w:p>
       <w:pPr>
         <w:spacing w:before="6" w:after="60"/>
-      </w:pPr>
-      <w:r>
         <w:rPr>
           <w:i/>
           <w:iCs/>
@@ -457,113 +693,6 @@
           <w:sz w:val="18"/>
           <w:szCs w:val="18"/>
         </w:rPr>
-        <w:t>ESP32 · C/C++ · MQTT · Android Java · Spring Boot · Angular · MySQL · Firebase · Scikit-learn</w:t>
-      </w:r>
-    </w:p>
-    <w:p>
-      <w:pPr>
-        <w:tabs>
-          <w:tab w:val="right" w:pos="9946"/>
-        </w:tabs>
-        <w:spacing w:before="140" w:after="20"/>
-      </w:pPr>
-      <w:r>
-        <w:rPr>
-          <w:b/>
-          <w:bCs/>
-          <w:sz w:val="21"/>
-          <w:szCs w:val="21"/>
-        </w:rPr>
-        <w:t xml:space="preserve">Summer Internship — </w:t>
-      </w:r>
-      <w:r>
-        <w:rPr>
-          <w:b/>
-          <w:bCs/>
-          <w:sz w:val="21"/>
-          <w:szCs w:val="21"/>
-        </w:rPr>
-        <w:t>Android Developer</w:t>
-      </w:r>
-      <w:r>
-        <w:rPr>
-          <w:b/>
-          <w:bCs/>
-          <w:sz w:val="21"/>
-          <w:szCs w:val="21"/>
-        </w:rPr>
-        <w:t xml:space="preserve"> </w:t>
-      </w:r>
-      <w:r>
-        <w:rPr>
-          <w:sz w:val="21"/>
-          <w:szCs w:val="21"/>
-        </w:rPr>
-        <w:t xml:space="preserve">· </w:t>
-      </w:r>
-      <w:proofErr w:type="spellStart"/>
-      <w:r>
-        <w:rPr>
-          <w:sz w:val="21"/>
-          <w:szCs w:val="21"/>
-        </w:rPr>
-        <w:t>Sagemcom</w:t>
-      </w:r>
-      <w:proofErr w:type="spellEnd"/>
-      <w:r>
-        <w:rPr>
-          <w:sz w:val="21"/>
-          <w:szCs w:val="21"/>
-        </w:rPr>
-        <w:t xml:space="preserve"> Software &amp; Technologies</w:t>
-      </w:r>
-      <w:r>
-        <w:rPr>
-          <w:sz w:val="21"/>
-          <w:szCs w:val="21"/>
-        </w:rPr>
-        <w:t xml:space="preserve">    </w:t>
-      </w:r>
-      <w:r>
-        <w:rPr>
-          <w:color w:val="555555"/>
-          <w:sz w:val="19"/>
-          <w:szCs w:val="19"/>
-        </w:rPr>
-        <w:t xml:space="preserve"> </w:t>
-      </w:r>
-      <w:r>
-        <w:rPr>
-          <w:color w:val="555555"/>
-        </w:rPr>
-        <w:t xml:space="preserve">Jul 2024 – Aug </w:t>
-      </w:r>
-      <w:r>
-        <w:rPr>
-          <w:color w:val="555555"/>
-        </w:rPr>
-        <w:t>2024</w:t>
-      </w:r>
-    </w:p>
-    <w:p>
-      <w:pPr>
-        <w:spacing w:after="10"/>
-      </w:pPr>
-      <w:r>
-        <w:t xml:space="preserve">Android inventory management app for the water-sensor R&amp;D team: full product CRUD, advanced filtering, and local SQLite database. Integrated an </w:t>
-      </w:r>
-      <w:proofErr w:type="spellStart"/>
-      <w:r>
-        <w:t>EfficientNet</w:t>
-      </w:r>
-      <w:proofErr w:type="spellEnd"/>
-      <w:r>
-        <w:t xml:space="preserve"> CNN (TensorFlow Lite) for automatic recognition of existing products via camera — –80% data-entry errors, identification time cut from 30 s to under 5 s.</w:t>
-      </w:r>
-    </w:p>
-    <w:p>
-      <w:pPr>
-        <w:spacing w:before="6" w:after="60"/>
       </w:pPr>
       <w:r>
         <w:rPr>
@@ -573,9 +702,8 @@
           <w:sz w:val="18"/>
           <w:szCs w:val="18"/>
         </w:rPr>
-        <w:t xml:space="preserve">Android Java · TensorFlow Lite · </w:t>
-      </w:r>
-      <w:proofErr w:type="spellStart"/>
+        <w:t>Next.js 16 · Spring Boot · Groq LLM</w:t>
+      </w:r>
       <w:r>
         <w:rPr>
           <w:i/>
@@ -584,9 +712,8 @@
           <w:sz w:val="18"/>
           <w:szCs w:val="18"/>
         </w:rPr>
-        <w:t>EfficientNet</w:t>
-      </w:r>
-      <w:proofErr w:type="spellEnd"/>
+        <w:t xml:space="preserve"> QWEN 3.5</w:t>
+      </w:r>
       <w:r>
         <w:rPr>
           <w:i/>
@@ -595,10 +722,12 @@
           <w:sz w:val="18"/>
           <w:szCs w:val="18"/>
         </w:rPr>
-        <w:t xml:space="preserve"> · Room DB · SQLite · </w:t>
-      </w:r>
-      <w:proofErr w:type="spellStart"/>
-      <w:r>
+        <w:t xml:space="preserve"> · TypeScript · Tailwind · JWT</w:t>
+      </w:r>
+    </w:p>
+    <w:p>
+      <w:pPr>
+        <w:spacing w:before="6" w:after="60"/>
         <w:rPr>
           <w:i/>
           <w:iCs/>
@@ -606,267 +735,11 @@
           <w:sz w:val="18"/>
           <w:szCs w:val="18"/>
         </w:rPr>
-        <w:t>ZXing</w:t>
-      </w:r>
-      <w:proofErr w:type="spellEnd"/>
-    </w:p>
-    <w:p>
-      <w:pPr>
-        <w:pBdr>
-          <w:bottom w:val="single" w:sz="4" w:space="1" w:color="000000"/>
-        </w:pBdr>
-        <w:spacing w:before="60" w:after="60"/>
-      </w:pPr>
-    </w:p>
-    <w:p>
-      <w:pPr>
-        <w:spacing w:before="180" w:after="60"/>
-      </w:pPr>
-      <w:r>
-        <w:rPr>
-          <w:b/>
-          <w:bCs/>
-          <w:sz w:val="21"/>
-          <w:szCs w:val="21"/>
-        </w:rPr>
-        <w:t>EDUCATION</w:t>
-      </w:r>
-    </w:p>
-    <w:p>
-      <w:pPr>
-        <w:tabs>
-          <w:tab w:val="right" w:pos="9946"/>
-        </w:tabs>
-        <w:spacing w:before="140" w:after="20"/>
-      </w:pPr>
-      <w:r>
-        <w:rPr>
-          <w:b/>
-          <w:bCs/>
-          <w:sz w:val="21"/>
-          <w:szCs w:val="21"/>
-        </w:rPr>
-        <w:t>Engineering Degree — Big Data &amp; AI</w:t>
-      </w:r>
-      <w:r>
-        <w:rPr>
-          <w:sz w:val="21"/>
-          <w:szCs w:val="21"/>
-        </w:rPr>
-        <w:t xml:space="preserve">  ·  Polytech International</w:t>
-      </w:r>
-      <w:r>
-        <w:rPr>
-          <w:color w:val="555555"/>
-          <w:sz w:val="19"/>
-          <w:szCs w:val="19"/>
-        </w:rPr>
-        <w:tab/>
-        <w:t>Sep 2025 – Present  |  Tunis</w:t>
-      </w:r>
-    </w:p>
-    <w:p>
-      <w:pPr>
-        <w:spacing w:after="10"/>
-      </w:pPr>
-      <w:r>
-        <w:t>First-year common core in progress. Specialisation in Big Data &amp; AI.</w:t>
-      </w:r>
-    </w:p>
-    <w:p>
-      <w:pPr>
-        <w:tabs>
-          <w:tab w:val="right" w:pos="9946"/>
-        </w:tabs>
-        <w:spacing w:before="140" w:after="20"/>
-      </w:pPr>
-      <w:r>
-        <w:rPr>
-          <w:b/>
-          <w:bCs/>
-          <w:sz w:val="21"/>
-          <w:szCs w:val="21"/>
-        </w:rPr>
-        <w:t>Licence — Embedded Systems &amp; Mobile Development</w:t>
-      </w:r>
-      <w:r>
-        <w:rPr>
-          <w:sz w:val="21"/>
-          <w:szCs w:val="21"/>
-        </w:rPr>
-        <w:t xml:space="preserve">  ·  ISET </w:t>
-      </w:r>
-      <w:proofErr w:type="spellStart"/>
-      <w:r>
-        <w:rPr>
-          <w:sz w:val="21"/>
-          <w:szCs w:val="21"/>
-        </w:rPr>
-        <w:t>Charguia</w:t>
-      </w:r>
-      <w:proofErr w:type="spellEnd"/>
-      <w:r>
-        <w:rPr>
-          <w:color w:val="555555"/>
-          <w:sz w:val="19"/>
-          <w:szCs w:val="19"/>
-        </w:rPr>
-        <w:tab/>
-        <w:t>2022 – 2025  |  Tunis</w:t>
-      </w:r>
-    </w:p>
-    <w:p>
-      <w:pPr>
-        <w:spacing w:after="60"/>
-      </w:pPr>
-      <w:r>
-        <w:t>GPA 16.78/20 . Core modules: IoT systems, embedded C/C++, Android development, computer networks.</w:t>
-      </w:r>
-    </w:p>
-    <w:p>
-      <w:pPr>
-        <w:pBdr>
-          <w:bottom w:val="single" w:sz="4" w:space="1" w:color="000000"/>
-        </w:pBdr>
-        <w:spacing w:before="60" w:after="60"/>
-      </w:pPr>
-    </w:p>
-    <w:p>
-      <w:pPr>
-        <w:spacing w:before="180" w:after="60"/>
-        <w:rPr>
-          <w:b/>
-          <w:bCs/>
-          <w:sz w:val="21"/>
-          <w:szCs w:val="21"/>
-        </w:rPr>
-      </w:pPr>
-    </w:p>
-    <w:p>
-      <w:pPr>
-        <w:spacing w:before="180" w:after="60"/>
-        <w:rPr>
-          <w:b/>
-          <w:bCs/>
-          <w:sz w:val="21"/>
-          <w:szCs w:val="21"/>
-        </w:rPr>
-      </w:pPr>
-    </w:p>
-    <w:p>
-      <w:pPr>
-        <w:spacing w:before="180" w:after="60"/>
-        <w:rPr>
-          <w:b/>
-          <w:bCs/>
-          <w:sz w:val="21"/>
-          <w:szCs w:val="21"/>
-        </w:rPr>
-      </w:pPr>
-    </w:p>
-    <w:p>
-      <w:pPr>
-        <w:spacing w:before="180" w:after="60"/>
-      </w:pPr>
-      <w:r>
-        <w:rPr>
-          <w:b/>
-          <w:bCs/>
-          <w:sz w:val="21"/>
-          <w:szCs w:val="21"/>
-        </w:rPr>
-        <w:t>PROJECTS</w:t>
-      </w:r>
-    </w:p>
-    <w:p>
-      <w:pPr>
-        <w:spacing w:before="140" w:after="18"/>
-      </w:pPr>
-      <w:r>
-        <w:rPr>
-          <w:b/>
-          <w:bCs/>
-          <w:sz w:val="21"/>
-          <w:szCs w:val="21"/>
-        </w:rPr>
-        <w:t>Intelligent Report Generator</w:t>
-      </w:r>
-      <w:r>
-        <w:rPr>
-          <w:color w:val="555555"/>
-          <w:sz w:val="19"/>
-          <w:szCs w:val="19"/>
-        </w:rPr>
-        <w:t xml:space="preserve">  ·  Samsung Innovation Campus AI Capstone</w:t>
-      </w:r>
-      <w:r>
-        <w:rPr>
-          <w:b/>
-          <w:bCs/>
-          <w:sz w:val="19"/>
-          <w:szCs w:val="19"/>
-        </w:rPr>
-        <w:t xml:space="preserve">  —  Score 94% — Top 6%</w:t>
-      </w:r>
-    </w:p>
-    <w:p>
-      <w:pPr>
-        <w:spacing w:after="10"/>
-      </w:pPr>
-      <w:r>
-        <w:t xml:space="preserve">Multi-modal AI system generating structured consumer reports from </w:t>
-      </w:r>
-      <w:r>
-        <w:t xml:space="preserve">electronic </w:t>
-      </w:r>
-      <w:r>
-        <w:t>product images and customer reviews</w:t>
-      </w:r>
-      <w:r>
-        <w:t xml:space="preserve"> from Amazon </w:t>
-      </w:r>
-      <w:proofErr w:type="spellStart"/>
-      <w:r>
-        <w:t>kaggle</w:t>
-      </w:r>
-      <w:proofErr w:type="spellEnd"/>
-      <w:r>
-        <w:t xml:space="preserve"> datasets</w:t>
-      </w:r>
-      <w:r>
-        <w:t>. EfficientNetB3 pipeline (visual recognition) combined with a parallel NLP stack</w:t>
-      </w:r>
-      <w:r>
-        <w:t xml:space="preserve"> , </w:t>
-      </w:r>
-      <w:proofErr w:type="spellStart"/>
-      <w:r>
-        <w:t>BiLSTM</w:t>
-      </w:r>
-      <w:proofErr w:type="spellEnd"/>
-      <w:r>
-        <w:t>, BERT, SmolLM2-1.7B</w:t>
-      </w:r>
-      <w:r>
-        <w:t>,</w:t>
-      </w:r>
-      <w:r>
-        <w:t xml:space="preserve"> for sentiment, emotion, and feature extraction. Hybrid summarisation with BART / T5 / Qwen2.5 producing a clean structured report. </w:t>
-      </w:r>
-      <w:proofErr w:type="spellStart"/>
-      <w:r>
-        <w:t>Streamlit</w:t>
-      </w:r>
-      <w:proofErr w:type="spellEnd"/>
-      <w:r>
-        <w:t xml:space="preserve"> interface + Flask backend.</w:t>
-      </w:r>
+      </w:pPr>
     </w:p>
     <w:p>
       <w:pPr>
         <w:spacing w:before="6" w:after="60"/>
-      </w:pPr>
-      <w:r>
         <w:rPr>
           <w:i/>
           <w:iCs/>
@@ -874,10 +747,56 @@
           <w:sz w:val="18"/>
           <w:szCs w:val="18"/>
         </w:rPr>
-        <w:t xml:space="preserve">Python · TensorFlow · </w:t>
-      </w:r>
-      <w:proofErr w:type="spellStart"/>
-      <w:r>
+      </w:pPr>
+      <w:r>
+        <w:rPr>
+          <w:b/>
+          <w:bCs/>
+          <w:color w:val="000000" w:themeColor="text1"/>
+          <w:sz w:val="21"/>
+          <w:szCs w:val="21"/>
+        </w:rPr>
+        <w:t>Aether Analyst · Local-First RAG &amp; AI Data Science Agent</w:t>
+      </w:r>
+      <w:r>
+        <w:rPr>
+          <w:color w:val="000000" w:themeColor="text1"/>
+        </w:rPr>
+        <w:t xml:space="preserve"> </w:t>
+      </w:r>
+      <w:r>
+        <w:rPr>
+          <w:color w:val="3A3A3A" w:themeColor="background2" w:themeShade="40"/>
+        </w:rPr>
+        <w:t>· Personal Project</w:t>
+      </w:r>
+      <w:r>
+        <w:rPr>
+          <w:color w:val="000000" w:themeColor="text1"/>
+        </w:rPr>
+        <w:br/>
+        <w:t>Production-grade AI analytics platform combining autonomous data analysis and local RAG pipelines for datasets and documents. Built an agentic LangGraph workflow capable of generating and executing Python code securely, self-correcting errors, and producing insights, visualisations, and reports. Implemented local embeddings + vector search for grounded document Q&amp;A with full offline privacy using Ollama-hosted LLMs.</w:t>
+      </w:r>
+      <w:r>
+        <w:rPr>
+          <w:color w:val="000000" w:themeColor="text1"/>
+        </w:rPr>
+        <w:br/>
+      </w:r>
+      <w:r>
+        <w:rPr>
+          <w:i/>
+          <w:iCs/>
+          <w:color w:val="747474" w:themeColor="background2" w:themeShade="80"/>
+          <w:sz w:val="18"/>
+          <w:szCs w:val="18"/>
+        </w:rPr>
+        <w:t>Python · LangGraph · LangChain · Ollama · Qwen2.5 · FAISS · Pandas · Plotly · Streamlit · RAG · Agentic AI</w:t>
+      </w:r>
+    </w:p>
+    <w:p>
+      <w:pPr>
+        <w:spacing w:before="6" w:after="60"/>
         <w:rPr>
           <w:i/>
           <w:iCs/>
@@ -885,138 +804,56 @@
           <w:sz w:val="18"/>
           <w:szCs w:val="18"/>
         </w:rPr>
-        <w:t>PyTorch</w:t>
-      </w:r>
-      <w:proofErr w:type="spellEnd"/>
-      <w:r>
+      </w:pPr>
+    </w:p>
+    <w:p>
+      <w:pPr>
+        <w:spacing w:before="6" w:after="60"/>
+      </w:pPr>
+      <w:r>
+        <w:rPr>
+          <w:b/>
+          <w:bCs/>
+        </w:rPr>
+        <w:t xml:space="preserve">End-to-End MLOps Customer Segmentation Platform </w:t>
+      </w:r>
+      <w:r>
+        <w:rPr>
+          <w:color w:val="808080" w:themeColor="background1" w:themeShade="80"/>
+        </w:rPr>
+        <w:t>· Personal Project</w:t>
+      </w:r>
+      <w:r>
+        <w:rPr>
+          <w:b/>
+          <w:bCs/>
+        </w:rPr>
+        <w:br/>
+      </w:r>
+      <w:r>
+        <w:t>Built and deployed a production-ready customer segmentation system from raw retail data to a FastAPI + Streamlit application. Delivered the full pipeline (EDA, ETL, feature engineering, KMeans clustering, validation, explainability, Dockerized deployment) for single and batch scoring. Segmented 4,312 customers into 4 personas: Champions, At-Risk Loyalists, Potential Growth, and New / Passive, enabling targeted retention, reactivation, and upsell actions for marketing, CRM, and growth teams through explainable, persona-level intelligence</w:t>
+      </w:r>
+    </w:p>
+    <w:p>
+      <w:pPr>
+        <w:spacing w:before="6" w:after="60"/>
         <w:rPr>
           <w:i/>
           <w:iCs/>
-          <w:color w:val="555555"/>
+          <w:color w:val="808080" w:themeColor="background1" w:themeShade="80"/>
           <w:sz w:val="18"/>
           <w:szCs w:val="18"/>
         </w:rPr>
-        <w:t xml:space="preserve"> · EfficientNetB3 · BERT · Qwen2.5 · </w:t>
-      </w:r>
-      <w:proofErr w:type="spellStart"/>
+      </w:pPr>
       <w:r>
         <w:rPr>
           <w:i/>
           <w:iCs/>
-          <w:color w:val="555555"/>
+          <w:color w:val="808080" w:themeColor="background1" w:themeShade="80"/>
           <w:sz w:val="18"/>
           <w:szCs w:val="18"/>
         </w:rPr>
-        <w:t>Streamlit</w:t>
-      </w:r>
-      <w:proofErr w:type="spellEnd"/>
-      <w:r>
-        <w:rPr>
-          <w:i/>
-          <w:iCs/>
-          <w:color w:val="555555"/>
-          <w:sz w:val="18"/>
-          <w:szCs w:val="18"/>
-        </w:rPr>
-        <w:t xml:space="preserve"> · Flask</w:t>
-      </w:r>
-    </w:p>
-    <w:p>
-      <w:pPr>
-        <w:spacing w:before="140" w:after="18"/>
-      </w:pPr>
-      <w:proofErr w:type="spellStart"/>
-      <w:r>
-        <w:rPr>
-          <w:b/>
-          <w:bCs/>
-          <w:sz w:val="21"/>
-          <w:szCs w:val="21"/>
-        </w:rPr>
-        <w:t>GetHired</w:t>
-      </w:r>
-      <w:proofErr w:type="spellEnd"/>
-      <w:r>
-        <w:rPr>
-          <w:b/>
-          <w:bCs/>
-          <w:sz w:val="21"/>
-          <w:szCs w:val="21"/>
-        </w:rPr>
-        <w:t xml:space="preserve"> AI</w:t>
-      </w:r>
-      <w:r>
-        <w:rPr>
-          <w:color w:val="555555"/>
-          <w:sz w:val="19"/>
-          <w:szCs w:val="19"/>
-        </w:rPr>
-        <w:t xml:space="preserve">  ·  Full-Stack AI Recruitment Platform</w:t>
-      </w:r>
-    </w:p>
-    <w:p>
-      <w:pPr>
-        <w:spacing w:after="10"/>
-      </w:pPr>
-      <w:r>
-        <w:t>End-to-end recruitment platform — two portals, one goal: connecting the right candidates to the right recruiters through AI. Candidate side: CV analysis and enhancement, explainable fit scoring (0–100), personalised certification and skill recommendations to reach the target role, and interview preparation. Recruiter side: automatic candidate ranking based on profile and job requirements, interview plan generation, and targeted outreach. Multilingual (EN/FR), 18 AI modules.</w:t>
-      </w:r>
-    </w:p>
-    <w:p>
-      <w:pPr>
-        <w:spacing w:before="6" w:after="60"/>
-      </w:pPr>
-      <w:r>
-        <w:rPr>
-          <w:i/>
-          <w:iCs/>
-          <w:color w:val="555555"/>
-          <w:sz w:val="18"/>
-          <w:szCs w:val="18"/>
-        </w:rPr>
-        <w:t xml:space="preserve">Next.js 16 · Spring Boot · </w:t>
-      </w:r>
-      <w:proofErr w:type="spellStart"/>
-      <w:r>
-        <w:rPr>
-          <w:i/>
-          <w:iCs/>
-          <w:color w:val="555555"/>
-          <w:sz w:val="18"/>
-          <w:szCs w:val="18"/>
-        </w:rPr>
-        <w:t>Groq</w:t>
-      </w:r>
-      <w:proofErr w:type="spellEnd"/>
-      <w:r>
-        <w:rPr>
-          <w:i/>
-          <w:iCs/>
-          <w:color w:val="555555"/>
-          <w:sz w:val="18"/>
-          <w:szCs w:val="18"/>
-        </w:rPr>
-        <w:t xml:space="preserve"> LLM</w:t>
-      </w:r>
-      <w:r>
-        <w:rPr>
-          <w:i/>
-          <w:iCs/>
-          <w:color w:val="555555"/>
-          <w:sz w:val="18"/>
-          <w:szCs w:val="18"/>
-        </w:rPr>
-        <w:t xml:space="preserve"> QWEN 3.5</w:t>
-      </w:r>
-      <w:r>
-        <w:rPr>
-          <w:i/>
-          <w:iCs/>
-          <w:color w:val="555555"/>
-          <w:sz w:val="18"/>
-          <w:szCs w:val="18"/>
-        </w:rPr>
-        <w:t xml:space="preserve"> · TypeScript · Tailwind · JWT</w:t>
+        <w:t xml:space="preserve">Python · Pandas · NumPy · Scikit-learn (KMeans) · Jupyter Notebooks · Matplotlib · Seaborn · FastAPI · Streamlit · Docker · </w:t>
       </w:r>
     </w:p>
     <w:p>
@@ -1080,40 +917,11 @@
           <w:b/>
           <w:bCs/>
         </w:rPr>
-        <w:t xml:space="preserve">63H IoT </w:t>
-      </w:r>
-      <w:proofErr w:type="spellStart"/>
-      <w:r>
-        <w:rPr>
-          <w:b/>
-          <w:bCs/>
-        </w:rPr>
-        <w:t>PHPoC</w:t>
-      </w:r>
-      <w:proofErr w:type="spellEnd"/>
-      <w:r>
-        <w:rPr>
-          <w:b/>
-          <w:bCs/>
-        </w:rPr>
-        <w:t xml:space="preserve"> Certification </w:t>
-      </w:r>
-      <w:r>
-        <w:t xml:space="preserve">— </w:t>
-      </w:r>
-      <w:proofErr w:type="spellStart"/>
-      <w:r>
-        <w:t>PHPoC</w:t>
-      </w:r>
-      <w:proofErr w:type="spellEnd"/>
-      <w:r>
-        <w:t xml:space="preserve"> South Korea · ISET </w:t>
-      </w:r>
-      <w:proofErr w:type="spellStart"/>
-      <w:r>
-        <w:t>Charguia</w:t>
-      </w:r>
-      <w:proofErr w:type="spellEnd"/>
+        <w:t xml:space="preserve">63H IoT PHPoC Certification </w:t>
+      </w:r>
+      <w:r>
+        <w:t>— PHPoC South Korea · ISET Charguia</w:t>
+      </w:r>
     </w:p>
     <w:p>
       <w:pPr>
@@ -1209,33 +1017,43 @@
                 <w:sz w:val="19"/>
                 <w:szCs w:val="19"/>
               </w:rPr>
-              <w:t xml:space="preserve">Machine Learning · Deep Learning · NLP · Computer Vision · TensorFlow · </w:t>
+              <w:t>Machine Learning · Deep Learning · NLP · Computer Vision · TensorFlow · PyTorch · Scikit-learn · Keras</w:t>
             </w:r>
-            <w:proofErr w:type="spellStart"/>
             <w:r>
               <w:rPr>
                 <w:sz w:val="19"/>
                 <w:szCs w:val="19"/>
               </w:rPr>
-              <w:t>PyTorch</w:t>
+              <w:t xml:space="preserve"> </w:t>
             </w:r>
-            <w:proofErr w:type="spellEnd"/>
             <w:r>
               <w:rPr>
                 <w:sz w:val="19"/>
                 <w:szCs w:val="19"/>
               </w:rPr>
-              <w:t xml:space="preserve"> · Scikit-learn · </w:t>
+              <w:t xml:space="preserve">· </w:t>
             </w:r>
-            <w:proofErr w:type="spellStart"/>
             <w:r>
               <w:rPr>
                 <w:sz w:val="19"/>
                 <w:szCs w:val="19"/>
               </w:rPr>
-              <w:t>Keras</w:t>
+              <w:t xml:space="preserve">RAG </w:t>
             </w:r>
-            <w:proofErr w:type="spellEnd"/>
+            <w:r>
+              <w:rPr>
+                <w:sz w:val="19"/>
+                <w:szCs w:val="19"/>
+              </w:rPr>
+              <w:t xml:space="preserve">· </w:t>
+            </w:r>
+            <w:r>
+              <w:rPr>
+                <w:sz w:val="19"/>
+                <w:szCs w:val="19"/>
+              </w:rPr>
+              <w:t>Langraph</w:t>
+            </w:r>
           </w:p>
         </w:tc>
       </w:tr>
@@ -1290,39 +1108,7 @@
                 <w:sz w:val="19"/>
                 <w:szCs w:val="19"/>
               </w:rPr>
-              <w:t xml:space="preserve">Pandas · NumPy · Matplotlib · Seaborn · </w:t>
-            </w:r>
-            <w:proofErr w:type="spellStart"/>
-            <w:r>
-              <w:rPr>
-                <w:sz w:val="19"/>
-                <w:szCs w:val="19"/>
-              </w:rPr>
-              <w:t>Plotly</w:t>
-            </w:r>
-            <w:proofErr w:type="spellEnd"/>
-            <w:r>
-              <w:rPr>
-                <w:sz w:val="19"/>
-                <w:szCs w:val="19"/>
-              </w:rPr>
-              <w:t xml:space="preserve"> · </w:t>
-            </w:r>
-            <w:proofErr w:type="spellStart"/>
-            <w:r>
-              <w:rPr>
-                <w:sz w:val="19"/>
-                <w:szCs w:val="19"/>
-              </w:rPr>
-              <w:t>Jupyter</w:t>
-            </w:r>
-            <w:proofErr w:type="spellEnd"/>
-            <w:r>
-              <w:rPr>
-                <w:sz w:val="19"/>
-                <w:szCs w:val="19"/>
-              </w:rPr>
-              <w:t xml:space="preserve"> · SQL</w:t>
+              <w:t>Pandas · NumPy · Matplotlib · Seaborn · Plotly · Jupyter · SQL</w:t>
             </w:r>
           </w:p>
         </w:tc>
@@ -1384,25 +1170,7 @@
                 <w:szCs w:val="19"/>
                 <w:lang w:val="fr-FR"/>
               </w:rPr>
-              <w:t xml:space="preserve">Python · Java · JavaScript / </w:t>
-            </w:r>
-            <w:proofErr w:type="spellStart"/>
-            <w:r>
-              <w:rPr>
-                <w:sz w:val="19"/>
-                <w:szCs w:val="19"/>
-                <w:lang w:val="fr-FR"/>
-              </w:rPr>
-              <w:t>TypeScript</w:t>
-            </w:r>
-            <w:proofErr w:type="spellEnd"/>
-            <w:r>
-              <w:rPr>
-                <w:sz w:val="19"/>
-                <w:szCs w:val="19"/>
-                <w:lang w:val="fr-FR"/>
-              </w:rPr>
-              <w:t xml:space="preserve"> · Dart · C / C++ · SQL</w:t>
+              <w:t>Python · Java · JavaScript / TypeScript · Dart · C / C++ · SQL</w:t>
             </w:r>
           </w:p>
         </w:tc>
@@ -1458,23 +1226,7 @@
                 <w:sz w:val="19"/>
                 <w:szCs w:val="19"/>
               </w:rPr>
-              <w:t xml:space="preserve">Android Java · Flutter · React · Next.js · Angular · </w:t>
-            </w:r>
-            <w:proofErr w:type="spellStart"/>
-            <w:r>
-              <w:rPr>
-                <w:sz w:val="19"/>
-                <w:szCs w:val="19"/>
-              </w:rPr>
-              <w:t>Streamlit</w:t>
-            </w:r>
-            <w:proofErr w:type="spellEnd"/>
-            <w:r>
-              <w:rPr>
-                <w:sz w:val="19"/>
-                <w:szCs w:val="19"/>
-              </w:rPr>
-              <w:t xml:space="preserve"> · Django</w:t>
+              <w:t>Android Java · Flutter · React · Next.js · Angular · Streamlit · Django</w:t>
             </w:r>
           </w:p>
         </w:tc>
@@ -1530,23 +1282,7 @@
                 <w:sz w:val="19"/>
                 <w:szCs w:val="19"/>
               </w:rPr>
-              <w:t xml:space="preserve">Spring Boot · Flask · </w:t>
-            </w:r>
-            <w:proofErr w:type="spellStart"/>
-            <w:r>
-              <w:rPr>
-                <w:sz w:val="19"/>
-                <w:szCs w:val="19"/>
-              </w:rPr>
-              <w:t>FastAPI</w:t>
-            </w:r>
-            <w:proofErr w:type="spellEnd"/>
-            <w:r>
-              <w:rPr>
-                <w:sz w:val="19"/>
-                <w:szCs w:val="19"/>
-              </w:rPr>
-              <w:t xml:space="preserve"> · Node.js · REST APIs · MySQL · MongoDB · SQLite</w:t>
+              <w:t>Spring Boot · Flask · FastAPI · Node.js · REST APIs · MySQL · MongoDB · SQLite</w:t>
             </w:r>
           </w:p>
         </w:tc>
@@ -1801,7 +1537,7 @@
 </file>
 
 <file path=word/numbering.xml><?xml version="1.0" encoding="utf-8"?>
-<w:numbering xmlns:wpc="http://schemas.microsoft.com/office/word/2010/wordprocessingCanvas" xmlns:cx="http://schemas.microsoft.com/office/drawing/2014/chartex" xmlns:cx1="http://schemas.microsoft.com/office/drawing/2015/9/8/chartex" xmlns:cx2="http://schemas.microsoft.com/office/drawing/2015/10/21/chartex" xmlns:cx3="http://schemas.microsoft.com/office/drawing/2016/5/9/chartex" xmlns:cx4="http://schemas.microsoft.com/office/drawing/2016/5/10/chartex" xmlns:cx5="http://schemas.microsoft.com/office/drawing/2016/5/11/chartex" xmlns:cx6="http://schemas.microsoft.com/office/drawing/2016/5/12/chartex" xmlns:cx7="http://schemas.microsoft.com/office/drawing/2016/5/13/chartex" xmlns:cx8="http://schemas.microsoft.com/office/drawing/2016/5/14/chartex" xmlns:mc="http://schemas.openxmlformats.org/markup-compatibility/2006" xmlns:aink="http://schemas.microsoft.com/office/drawing/2016/ink" xmlns:am3d="http://schemas.microsoft.com/office/drawing/2017/model3d" xmlns:o="urn:schemas-microsoft-com:office:office" xmlns:oel="http://schemas.microsoft.com/office/2019/extlst" xmlns:r="http://schemas.openxmlformats.org/officeDocument/2006/relationships" xmlns:m="http://schemas.openxmlformats.org/officeDocument/2006/math" xmlns:v="urn:schemas-microsoft-com:vml" xmlns:wp14="http://schemas.microsoft.com/office/word/2010/wordprocessingDrawing" xmlns:wp="http://schemas.openxmlformats.org/drawingml/2006/wordprocessingDrawing" xmlns:w10="urn:schemas-microsoft-com:office:word" xmlns:w="http://schemas.openxmlformats.org/wordprocessingml/2006/main" xmlns:w14="http://schemas.microsoft.com/office/word/2010/wordml" xmlns:w15="http://schemas.microsoft.com/office/word/2012/wordml" xmlns:w16cex="http://schemas.microsoft.com/office/word/2018/wordml/cex" xmlns:w16cid="http://schemas.microsoft.com/office/word/2016/wordml/cid" xmlns:w16="http://schemas.microsoft.com/office/word/2018/wordml" xmlns:w16sdtdh="http://schemas.microsoft.com/office/word/2020/wordml/sdtdatahash" xmlns:w16se="http://schemas.microsoft.com/office/word/2015/wordml/symex" xmlns:wpg="http://schemas.microsoft.com/office/word/2010/wordprocessingGroup" xmlns:wpi="http://schemas.microsoft.com/office/word/2010/wordprocessingInk" xmlns:wne="http://schemas.microsoft.com/office/word/2006/wordml" xmlns:wps="http://schemas.microsoft.com/office/word/2010/wordprocessingShape" mc:Ignorable="w14 w15 w16se w16cid w16 w16cex w16sdtdh wp14">
+<w:numbering xmlns:wpc="http://schemas.microsoft.com/office/word/2010/wordprocessingCanvas" xmlns:cx="http://schemas.microsoft.com/office/drawing/2014/chartex" xmlns:cx1="http://schemas.microsoft.com/office/drawing/2015/9/8/chartex" xmlns:cx2="http://schemas.microsoft.com/office/drawing/2015/10/21/chartex" xmlns:cx3="http://schemas.microsoft.com/office/drawing/2016/5/9/chartex" xmlns:cx4="http://schemas.microsoft.com/office/drawing/2016/5/10/chartex" xmlns:cx5="http://schemas.microsoft.com/office/drawing/2016/5/11/chartex" xmlns:cx6="http://schemas.microsoft.com/office/drawing/2016/5/12/chartex" xmlns:cx7="http://schemas.microsoft.com/office/drawing/2016/5/13/chartex" xmlns:cx8="http://schemas.microsoft.com/office/drawing/2016/5/14/chartex" xmlns:mc="http://schemas.openxmlformats.org/markup-compatibility/2006" xmlns:aink="http://schemas.microsoft.com/office/drawing/2016/ink" xmlns:am3d="http://schemas.microsoft.com/office/drawing/2017/model3d" xmlns:o="urn:schemas-microsoft-com:office:office" xmlns:oel="http://schemas.microsoft.com/office/2019/extlst" xmlns:r="http://schemas.openxmlformats.org/officeDocument/2006/relationships" xmlns:m="http://schemas.openxmlformats.org/officeDocument/2006/math" xmlns:v="urn:schemas-microsoft-com:vml" xmlns:wp14="http://schemas.microsoft.com/office/word/2010/wordprocessingDrawing" xmlns:wp="http://schemas.openxmlformats.org/drawingml/2006/wordprocessingDrawing" xmlns:w10="urn:schemas-microsoft-com:office:word" xmlns:w="http://schemas.openxmlformats.org/wordprocessingml/2006/main" xmlns:w14="http://schemas.microsoft.com/office/word/2010/wordml" xmlns:w15="http://schemas.microsoft.com/office/word/2012/wordml" xmlns:w16cex="http://schemas.microsoft.com/office/word/2018/wordml/cex" xmlns:w16cid="http://schemas.microsoft.com/office/word/2016/wordml/cid" xmlns:w16="http://schemas.microsoft.com/office/word/2018/wordml" xmlns:w16du="http://schemas.microsoft.com/office/word/2023/wordml/word16du" xmlns:w16sdtdh="http://schemas.microsoft.com/office/word/2020/wordml/sdtdatahash" xmlns:w16sdtfl="http://schemas.microsoft.com/office/word/2024/wordml/sdtformatlock" xmlns:w16se="http://schemas.microsoft.com/office/word/2015/wordml/symex" xmlns:wpg="http://schemas.microsoft.com/office/word/2010/wordprocessingGroup" xmlns:wpi="http://schemas.microsoft.com/office/word/2010/wordprocessingInk" xmlns:wne="http://schemas.microsoft.com/office/word/2006/wordml" xmlns:wps="http://schemas.microsoft.com/office/word/2010/wordprocessingShape" mc:Ignorable="w14 w15 w16se w16cid w16 w16cex w16sdtdh w16sdtfl w16du wp14">
   <w:abstractNum w:abstractNumId="0" w15:restartNumberingAfterBreak="0">
     <w:nsid w:val="1D807A7A"/>
     <w:multiLevelType w:val="hybridMultilevel"/>
@@ -1957,7 +1693,7 @@
 </file>
 
 <file path=word/styles.xml><?xml version="1.0" encoding="utf-8"?>
-<w:styles xmlns:mc="http://schemas.openxmlformats.org/markup-compatibility/2006" xmlns:r="http://schemas.openxmlformats.org/officeDocument/2006/relationships" xmlns:w="http://schemas.openxmlformats.org/wordprocessingml/2006/main" xmlns:w14="http://schemas.microsoft.com/office/word/2010/wordml" xmlns:w15="http://schemas.microsoft.com/office/word/2012/wordml" xmlns:w16cex="http://schemas.microsoft.com/office/word/2018/wordml/cex" xmlns:w16cid="http://schemas.microsoft.com/office/word/2016/wordml/cid" xmlns:w16="http://schemas.microsoft.com/office/word/2018/wordml" xmlns:w16sdtdh="http://schemas.microsoft.com/office/word/2020/wordml/sdtdatahash" xmlns:w16se="http://schemas.microsoft.com/office/word/2015/wordml/symex" mc:Ignorable="w14 w15 w16se w16cid w16 w16cex w16sdtdh">
+<w:styles xmlns:mc="http://schemas.openxmlformats.org/markup-compatibility/2006" xmlns:r="http://schemas.openxmlformats.org/officeDocument/2006/relationships" xmlns:w="http://schemas.openxmlformats.org/wordprocessingml/2006/main" xmlns:w14="http://schemas.microsoft.com/office/word/2010/wordml" xmlns:w15="http://schemas.microsoft.com/office/word/2012/wordml" xmlns:w16cex="http://schemas.microsoft.com/office/word/2018/wordml/cex" xmlns:w16cid="http://schemas.microsoft.com/office/word/2016/wordml/cid" xmlns:w16="http://schemas.microsoft.com/office/word/2018/wordml" xmlns:w16du="http://schemas.microsoft.com/office/word/2023/wordml/word16du" xmlns:w16sdtdh="http://schemas.microsoft.com/office/word/2020/wordml/sdtdatahash" xmlns:w16sdtfl="http://schemas.microsoft.com/office/word/2024/wordml/sdtformatlock" xmlns:w16se="http://schemas.microsoft.com/office/word/2015/wordml/symex" mc:Ignorable="w14 w15 w16se w16cid w16 w16cex w16sdtdh w16sdtfl w16du">
   <w:docDefaults>
     <w:rPrDefault>
       <w:rPr>
@@ -2349,6 +2085,7 @@
   <w:style w:type="paragraph" w:default="1" w:styleId="Normal">
     <w:name w:val="Normal"/>
     <w:qFormat/>
+    <w:rsid w:val="00052FB7"/>
   </w:style>
   <w:style w:type="paragraph" w:styleId="Heading1">
     <w:name w:val="heading 1"/>

</xml_diff>